<commit_message>
update scenario description (#18)
</commit_message>
<xml_diff>
--- a/docs/scenario/Description.docx
+++ b/docs/scenario/Description.docx
@@ -62,10 +62,10 @@
           <w:lang w:val="en-US"/>
         </w:rPr>
         <w:drawing>
-          <wp:inline distT="0" distB="0" distL="0" distR="0" wp14:anchorId="67DF9B35" wp14:editId="4BD106A8">
-            <wp:extent cx="4457700" cy="4137660"/>
-            <wp:effectExtent l="19050" t="19050" r="19050" b="15240"/>
-            <wp:docPr id="1955274503" name="Picture 4"/>
+          <wp:inline distT="0" distB="0" distL="0" distR="0" wp14:anchorId="5CABC920" wp14:editId="6A471E98">
+            <wp:extent cx="4488815" cy="4170045"/>
+            <wp:effectExtent l="0" t="0" r="6985" b="1905"/>
+            <wp:docPr id="1630930268" name="Picture 2"/>
             <wp:cNvGraphicFramePr>
               <a:graphicFrameLocks xmlns:a="http://schemas.openxmlformats.org/drawingml/2006/main" noChangeAspect="1"/>
             </wp:cNvGraphicFramePr>
@@ -73,13 +73,13 @@
               <a:graphicData uri="http://schemas.openxmlformats.org/drawingml/2006/picture">
                 <pic:pic xmlns:pic="http://schemas.openxmlformats.org/drawingml/2006/picture">
                   <pic:nvPicPr>
-                    <pic:cNvPr id="0" name="Picture 4"/>
+                    <pic:cNvPr id="0" name="Picture 2"/>
                     <pic:cNvPicPr>
                       <a:picLocks noChangeAspect="1" noChangeArrowheads="1"/>
                     </pic:cNvPicPr>
                   </pic:nvPicPr>
                   <pic:blipFill>
-                    <a:blip r:embed="rId4">
+                    <a:blip r:embed="rId5">
                       <a:extLst>
                         <a:ext uri="{28A0092B-C50C-407E-A947-70E740481C1C}">
                           <a14:useLocalDpi xmlns:a14="http://schemas.microsoft.com/office/drawing/2010/main" val="0"/>
@@ -94,16 +94,14 @@
                   <pic:spPr bwMode="auto">
                     <a:xfrm>
                       <a:off x="0" y="0"/>
-                      <a:ext cx="4457700" cy="4137660"/>
+                      <a:ext cx="4488815" cy="4170045"/>
                     </a:xfrm>
                     <a:prstGeom prst="rect">
                       <a:avLst/>
                     </a:prstGeom>
                     <a:noFill/>
                     <a:ln>
-                      <a:solidFill>
-                        <a:schemeClr val="tx1"/>
-                      </a:solidFill>
+                      <a:noFill/>
                     </a:ln>
                   </pic:spPr>
                 </pic:pic>
@@ -115,7 +113,333 @@
     </w:p>
     <w:p>
       <w:pPr>
-        <w:rPr>
+        <w:pBdr>
+          <w:bottom w:val="single" w:sz="6" w:space="1" w:color="auto"/>
+        </w:pBdr>
+        <w:jc w:val="center"/>
+        <w:rPr>
+          <w:lang w:val="en-US"/>
+        </w:rPr>
+      </w:pPr>
+    </w:p>
+    <w:p>
+      <w:pPr>
+        <w:jc w:val="center"/>
+        <w:rPr>
+          <w:lang w:val="en-US"/>
+        </w:rPr>
+      </w:pPr>
+    </w:p>
+    <w:p>
+      <w:pPr>
+        <w:jc w:val="center"/>
+        <w:rPr>
+          <w:b/>
+          <w:bCs/>
+        </w:rPr>
+      </w:pPr>
+      <w:r>
+        <w:rPr>
+          <w:b/>
+          <w:bCs/>
+        </w:rPr>
+        <w:t>Scenario Overview: SAP BW Data Flow for Bike Sales Reporting</w:t>
+      </w:r>
+    </w:p>
+    <w:p>
+      <w:r>
+        <w:t xml:space="preserve">This scenario outlines the data flow architecture for reporting bike sales through two distinct sales channels: </w:t>
+      </w:r>
+      <w:r>
+        <w:rPr>
+          <w:b/>
+          <w:bCs/>
+        </w:rPr>
+        <w:t>Internet Sales</w:t>
+      </w:r>
+      <w:r>
+        <w:t xml:space="preserve"> and </w:t>
+      </w:r>
+      <w:r>
+        <w:rPr>
+          <w:b/>
+          <w:bCs/>
+        </w:rPr>
+        <w:t>Reseller Sales</w:t>
+      </w:r>
+      <w:r>
+        <w:t>. The architecture is designed in SAP BW using standard InfoProviders and transformation logic to support unified and channel-specific reporting.</w:t>
+      </w:r>
+    </w:p>
+    <w:p>
+      <w:r>
+        <w:rPr>
+          <w:b/>
+          <w:bCs/>
+        </w:rPr>
+        <w:t>Sales Channels:</w:t>
+      </w:r>
+    </w:p>
+    <w:p>
+      <w:pPr>
+        <w:numPr>
+          <w:ilvl w:val="0"/>
+          <w:numId w:val="6"/>
+        </w:numPr>
+      </w:pPr>
+      <w:r>
+        <w:t>Internet Sales</w:t>
+      </w:r>
+    </w:p>
+    <w:p>
+      <w:pPr>
+        <w:numPr>
+          <w:ilvl w:val="0"/>
+          <w:numId w:val="6"/>
+        </w:numPr>
+      </w:pPr>
+      <w:r>
+        <w:t>Reseller Sales</w:t>
+      </w:r>
+    </w:p>
+    <w:p>
+      <w:r>
+        <w:t>Each channel has its own independent data acquisition and processing pipeline, yet they are ultimately consolidated for unified analysis.</w:t>
+      </w:r>
+    </w:p>
+    <w:p>
+      <w:pPr>
+        <w:rPr>
+          <w:b/>
+          <w:bCs/>
+        </w:rPr>
+      </w:pPr>
+      <w:r>
+        <w:rPr>
+          <w:b/>
+          <w:bCs/>
+        </w:rPr>
+        <w:t>Data Flow Description</w:t>
+      </w:r>
+    </w:p>
+    <w:p>
+      <w:r>
+        <w:rPr>
+          <w:b/>
+          <w:bCs/>
+        </w:rPr>
+        <w:t>1. Data Sources:</w:t>
+      </w:r>
+    </w:p>
+    <w:p>
+      <w:pPr>
+        <w:numPr>
+          <w:ilvl w:val="0"/>
+          <w:numId w:val="7"/>
+        </w:numPr>
+      </w:pPr>
+      <w:r>
+        <w:rPr>
+          <w:b/>
+          <w:bCs/>
+        </w:rPr>
+        <w:lastRenderedPageBreak/>
+        <w:t>DS for Internet Sales Transactional Data (DS_IS_TD):</w:t>
+      </w:r>
+      <w:r>
+        <w:t xml:space="preserve"> Captures transactional data related to online (internet-based) sales.</w:t>
+      </w:r>
+    </w:p>
+    <w:p>
+      <w:pPr>
+        <w:numPr>
+          <w:ilvl w:val="0"/>
+          <w:numId w:val="7"/>
+        </w:numPr>
+      </w:pPr>
+      <w:r>
+        <w:rPr>
+          <w:b/>
+          <w:bCs/>
+        </w:rPr>
+        <w:t>DS for Reseller Sales Transactional Data (DS_RS_TD):</w:t>
+      </w:r>
+      <w:r>
+        <w:t xml:space="preserve"> Gathers transactional sales data from reseller partners.</w:t>
+      </w:r>
+    </w:p>
+    <w:p>
+      <w:r>
+        <w:t>These data sources serve as the initial entry point of raw sales data into the SAP BW system.</w:t>
+      </w:r>
+    </w:p>
+    <w:p>
+      <w:r>
+        <w:rPr>
+          <w:b/>
+          <w:bCs/>
+        </w:rPr>
+        <w:t>2. Data Targets (ODS Layer / DataStore Objects):</w:t>
+      </w:r>
+    </w:p>
+    <w:p>
+      <w:pPr>
+        <w:numPr>
+          <w:ilvl w:val="0"/>
+          <w:numId w:val="8"/>
+        </w:numPr>
+      </w:pPr>
+      <w:r>
+        <w:rPr>
+          <w:b/>
+          <w:bCs/>
+        </w:rPr>
+        <w:t>Internet Sales Fact (TD_IS)</w:t>
+      </w:r>
+    </w:p>
+    <w:p>
+      <w:pPr>
+        <w:numPr>
+          <w:ilvl w:val="0"/>
+          <w:numId w:val="8"/>
+        </w:numPr>
+      </w:pPr>
+      <w:r>
+        <w:rPr>
+          <w:b/>
+          <w:bCs/>
+        </w:rPr>
+        <w:t>Reseller Sales Fact (TD_RS)</w:t>
+      </w:r>
+    </w:p>
+    <w:p>
+      <w:r>
+        <w:t>Transactional data is loaded 1:1 into these DataStore Objects. These represent the consolidation layer where data is cleansed and harmonized before being pushed into analytical InfoCubes.</w:t>
+      </w:r>
+    </w:p>
+    <w:p>
+      <w:r>
+        <w:rPr>
+          <w:b/>
+          <w:bCs/>
+        </w:rPr>
+        <w:t>3. InfoCubes (Analytical Layer):</w:t>
+      </w:r>
+    </w:p>
+    <w:p>
+      <w:pPr>
+        <w:numPr>
+          <w:ilvl w:val="0"/>
+          <w:numId w:val="9"/>
+        </w:numPr>
+      </w:pPr>
+      <w:r>
+        <w:rPr>
+          <w:b/>
+          <w:bCs/>
+        </w:rPr>
+        <w:t>Internet Sales InfoCube (TD_IS_C)</w:t>
+      </w:r>
+    </w:p>
+    <w:p>
+      <w:pPr>
+        <w:numPr>
+          <w:ilvl w:val="0"/>
+          <w:numId w:val="9"/>
+        </w:numPr>
+      </w:pPr>
+      <w:r>
+        <w:rPr>
+          <w:b/>
+          <w:bCs/>
+        </w:rPr>
+        <w:t>Reseller Sales InfoCube (TD_RS_C)</w:t>
+      </w:r>
+    </w:p>
+    <w:p>
+      <w:r>
+        <w:t xml:space="preserve">Data is transferred from the facts layer into the InfoCubes using </w:t>
+      </w:r>
+      <w:r>
+        <w:rPr>
+          <w:b/>
+          <w:bCs/>
+        </w:rPr>
+        <w:t>direct assignments (1:1), formulas, ABAP routines</w:t>
+      </w:r>
+      <w:r>
+        <w:rPr>
+          <w:b/>
+          <w:bCs/>
+          <w:lang w:val="en-US"/>
+        </w:rPr>
+        <w:t>, constants</w:t>
+      </w:r>
+      <w:r>
+        <w:t>, allowing for the enrichment of key figures and characteristics needed for reporting. These cubes store aggregated sales data for each channel, optimized for performance and analysis.</w:t>
+      </w:r>
+    </w:p>
+    <w:p>
+      <w:r>
+        <w:rPr>
+          <w:b/>
+          <w:bCs/>
+        </w:rPr>
+        <w:t>4. Consolidation for Reporting - Sales Multiprovider (SLS_MP)</w:t>
+      </w:r>
+      <w:r>
+        <w:br/>
+        <w:t>The InfoCubes for both Internet and Reseller Sales are combined into a Multiprovider, enabling a unified view of total sales. This allows users to:</w:t>
+      </w:r>
+    </w:p>
+    <w:p>
+      <w:pPr>
+        <w:numPr>
+          <w:ilvl w:val="0"/>
+          <w:numId w:val="10"/>
+        </w:numPr>
+      </w:pPr>
+      <w:r>
+        <w:t>Analyze sales by channel, region, time, product, and customer.</w:t>
+      </w:r>
+    </w:p>
+    <w:p>
+      <w:pPr>
+        <w:numPr>
+          <w:ilvl w:val="0"/>
+          <w:numId w:val="10"/>
+        </w:numPr>
+      </w:pPr>
+      <w:r>
+        <w:t>Compare performance between Internet and Reseller sales.</w:t>
+      </w:r>
+    </w:p>
+    <w:p>
+      <w:pPr>
+        <w:numPr>
+          <w:ilvl w:val="0"/>
+          <w:numId w:val="10"/>
+        </w:numPr>
+      </w:pPr>
+      <w:r>
+        <w:t>Generate comprehensive reports for management insights.</w:t>
+      </w:r>
+    </w:p>
+    <w:p>
+      <w:pPr>
+        <w:pBdr>
+          <w:bottom w:val="single" w:sz="6" w:space="1" w:color="auto"/>
+        </w:pBdr>
+        <w:rPr>
+          <w:lang w:val="en-US"/>
+        </w:rPr>
+      </w:pPr>
+    </w:p>
+    <w:p>
+      <w:pPr>
+        <w:rPr>
+          <w:b/>
+          <w:bCs/>
           <w:lang w:val="en-US"/>
         </w:rPr>
       </w:pPr>
@@ -131,7 +455,10 @@
           <w:lang w:val="en-US"/>
         </w:rPr>
       </w:pPr>
-      <w:r>
+    </w:p>
+    <w:p>
+      <w:pPr>
+        <w:jc w:val="center"/>
         <w:rPr>
           <w:b/>
           <w:bCs/>
@@ -139,9 +466,11 @@
           <w:szCs w:val="28"/>
           <w:lang w:val="en-US"/>
         </w:rPr>
-        <w:t>Transformations</w:t>
-      </w:r>
-      <w:r>
+      </w:pPr>
+    </w:p>
+    <w:p>
+      <w:pPr>
+        <w:jc w:val="center"/>
         <w:rPr>
           <w:b/>
           <w:bCs/>
@@ -149,6 +478,50 @@
           <w:szCs w:val="28"/>
           <w:lang w:val="en-US"/>
         </w:rPr>
+      </w:pPr>
+    </w:p>
+    <w:p>
+      <w:pPr>
+        <w:jc w:val="center"/>
+        <w:rPr>
+          <w:b/>
+          <w:bCs/>
+          <w:sz w:val="28"/>
+          <w:szCs w:val="28"/>
+          <w:lang w:val="en-US"/>
+        </w:rPr>
+      </w:pPr>
+    </w:p>
+    <w:p>
+      <w:pPr>
+        <w:jc w:val="center"/>
+        <w:rPr>
+          <w:b/>
+          <w:bCs/>
+          <w:sz w:val="28"/>
+          <w:szCs w:val="28"/>
+          <w:lang w:val="en-US"/>
+        </w:rPr>
+      </w:pPr>
+      <w:r>
+        <w:rPr>
+          <w:b/>
+          <w:bCs/>
+          <w:sz w:val="28"/>
+          <w:szCs w:val="28"/>
+          <w:lang w:val="en-US"/>
+        </w:rPr>
+        <w:lastRenderedPageBreak/>
+        <w:t>Transformations</w:t>
+      </w:r>
+      <w:r>
+        <w:rPr>
+          <w:b/>
+          <w:bCs/>
+          <w:sz w:val="28"/>
+          <w:szCs w:val="28"/>
+          <w:lang w:val="en-US"/>
+        </w:rPr>
         <w:t xml:space="preserve"> from DSO to CUBE</w:t>
       </w:r>
     </w:p>
@@ -239,7 +612,15 @@
         <w:t>ls</w:t>
       </w:r>
       <w:r>
-        <w:t xml:space="preserve"> contains source records which have to be processed and transformed </w:t>
+        <w:t xml:space="preserve"> contains source records which </w:t>
+      </w:r>
+      <w:proofErr w:type="gramStart"/>
+      <w:r>
+        <w:t>have to</w:t>
+      </w:r>
+      <w:proofErr w:type="gramEnd"/>
+      <w:r>
+        <w:t xml:space="preserve"> be processed and transformed </w:t>
       </w:r>
     </w:p>
     <w:p>
@@ -318,41 +699,29 @@
     </w:p>
     <w:p>
       <w:pPr>
-        <w:rPr>
-          <w:lang w:val="en-US"/>
-        </w:rPr>
-      </w:pPr>
-    </w:p>
-    <w:p>
-      <w:pPr>
-        <w:rPr>
-          <w:lang w:val="en-US"/>
-        </w:rPr>
-      </w:pPr>
-    </w:p>
-    <w:p>
-      <w:pPr>
-        <w:rPr>
-          <w:lang w:val="en-US"/>
-        </w:rPr>
-      </w:pPr>
-    </w:p>
-    <w:p>
-      <w:pPr>
-        <w:jc w:val="center"/>
-        <w:rPr>
-          <w:b/>
-          <w:bCs/>
-          <w:lang w:val="en-US"/>
-        </w:rPr>
-      </w:pPr>
-      <w:r>
-        <w:rPr>
-          <w:b/>
-          <w:bCs/>
-          <w:lang w:val="en-US"/>
-        </w:rPr>
-        <w:lastRenderedPageBreak/>
+        <w:jc w:val="center"/>
+        <w:rPr>
+          <w:b/>
+          <w:bCs/>
+          <w:lang w:val="en-US"/>
+        </w:rPr>
+      </w:pPr>
+    </w:p>
+    <w:p>
+      <w:pPr>
+        <w:jc w:val="center"/>
+        <w:rPr>
+          <w:b/>
+          <w:bCs/>
+          <w:lang w:val="en-US"/>
+        </w:rPr>
+      </w:pPr>
+      <w:r>
+        <w:rPr>
+          <w:b/>
+          <w:bCs/>
+          <w:lang w:val="en-US"/>
+        </w:rPr>
         <w:t>From DSO (TD_IS) To CUBE (TD_IS_C)</w:t>
       </w:r>
     </w:p>
@@ -384,7 +753,7 @@
                     </pic:cNvPicPr>
                   </pic:nvPicPr>
                   <pic:blipFill>
-                    <a:blip r:embed="rId5">
+                    <a:blip r:embed="rId6">
                       <a:extLst>
                         <a:ext uri="{28A0092B-C50C-407E-A947-70E740481C1C}">
                           <a14:useLocalDpi xmlns:a14="http://schemas.microsoft.com/office/drawing/2010/main" val="0"/>
@@ -420,20 +789,6 @@
     </w:p>
     <w:p>
       <w:pPr>
-        <w:rPr>
-          <w:lang w:val="en-US"/>
-        </w:rPr>
-      </w:pPr>
-    </w:p>
-    <w:p>
-      <w:pPr>
-        <w:rPr>
-          <w:lang w:val="en-US"/>
-        </w:rPr>
-      </w:pPr>
-    </w:p>
-    <w:p>
-      <w:pPr>
         <w:pBdr>
           <w:bottom w:val="single" w:sz="6" w:space="1" w:color="auto"/>
         </w:pBdr>
@@ -450,7 +805,29 @@
       </w:pPr>
     </w:p>
     <w:p>
-      <w:r>
+      <w:pPr>
+        <w:rPr>
+          <w:lang w:val="en-US"/>
+        </w:rPr>
+      </w:pPr>
+    </w:p>
+    <w:p>
+      <w:pPr>
+        <w:rPr>
+          <w:lang w:val="en-US"/>
+        </w:rPr>
+      </w:pPr>
+    </w:p>
+    <w:p>
+      <w:pPr>
+        <w:rPr>
+          <w:lang w:val="en-US"/>
+        </w:rPr>
+      </w:pPr>
+    </w:p>
+    <w:p>
+      <w:r>
+        <w:lastRenderedPageBreak/>
         <w:t xml:space="preserve">In this example we cover data transfer logic from ODSO </w:t>
       </w:r>
       <w:r>
@@ -563,7 +940,15 @@
         <w:t>ls</w:t>
       </w:r>
       <w:r>
-        <w:t xml:space="preserve"> contains source records which have to be processed and transformed </w:t>
+        <w:t xml:space="preserve"> contains source records which </w:t>
+      </w:r>
+      <w:proofErr w:type="gramStart"/>
+      <w:r>
+        <w:t>have to</w:t>
+      </w:r>
+      <w:proofErr w:type="gramEnd"/>
+      <w:r>
+        <w:t xml:space="preserve"> be processed and transformed </w:t>
       </w:r>
     </w:p>
     <w:p>
@@ -643,11 +1028,19 @@
       <w:r>
         <w:t xml:space="preserve">- contains the transformed records as they currently are in </w:t>
       </w:r>
-      <w:r>
-        <w:rPr>
-          <w:lang w:val="en-US"/>
-        </w:rPr>
-        <w:t>S13 Development</w:t>
+      <w:proofErr w:type="gramStart"/>
+      <w:r>
+        <w:rPr>
+          <w:lang w:val="en-US"/>
+        </w:rPr>
+        <w:t>S13</w:t>
+      </w:r>
+      <w:proofErr w:type="gramEnd"/>
+      <w:r>
+        <w:rPr>
+          <w:lang w:val="en-US"/>
+        </w:rPr>
+        <w:t xml:space="preserve"> Development</w:t>
       </w:r>
       <w:r>
         <w:t xml:space="preserve"> system, to be used for validation of the result. </w:t>
@@ -662,61 +1055,49 @@
     </w:p>
     <w:p>
       <w:pPr>
-        <w:rPr>
-          <w:lang w:val="en-US"/>
-        </w:rPr>
-      </w:pPr>
-    </w:p>
-    <w:p>
-      <w:pPr>
-        <w:rPr>
-          <w:lang w:val="en-US"/>
-        </w:rPr>
-      </w:pPr>
-    </w:p>
-    <w:p>
-      <w:pPr>
-        <w:rPr>
-          <w:lang w:val="en-US"/>
-        </w:rPr>
-      </w:pPr>
-    </w:p>
-    <w:p>
-      <w:pPr>
-        <w:jc w:val="center"/>
-        <w:rPr>
-          <w:b/>
-          <w:bCs/>
-          <w:lang w:val="en-US"/>
-        </w:rPr>
-      </w:pPr>
-    </w:p>
-    <w:p>
-      <w:pPr>
-        <w:jc w:val="center"/>
-        <w:rPr>
-          <w:b/>
-          <w:bCs/>
-          <w:lang w:val="en-US"/>
-        </w:rPr>
-      </w:pPr>
-    </w:p>
-    <w:p>
-      <w:pPr>
-        <w:jc w:val="center"/>
-        <w:rPr>
-          <w:b/>
-          <w:bCs/>
-          <w:lang w:val="en-US"/>
-        </w:rPr>
-      </w:pPr>
-      <w:r>
-        <w:rPr>
-          <w:b/>
-          <w:bCs/>
-          <w:lang w:val="en-US"/>
-        </w:rPr>
-        <w:lastRenderedPageBreak/>
+        <w:jc w:val="center"/>
+        <w:rPr>
+          <w:b/>
+          <w:bCs/>
+          <w:lang w:val="en-US"/>
+        </w:rPr>
+      </w:pPr>
+    </w:p>
+    <w:p>
+      <w:pPr>
+        <w:jc w:val="center"/>
+        <w:rPr>
+          <w:b/>
+          <w:bCs/>
+          <w:lang w:val="en-US"/>
+        </w:rPr>
+      </w:pPr>
+    </w:p>
+    <w:p>
+      <w:pPr>
+        <w:jc w:val="center"/>
+        <w:rPr>
+          <w:b/>
+          <w:bCs/>
+          <w:lang w:val="en-US"/>
+        </w:rPr>
+      </w:pPr>
+    </w:p>
+    <w:p>
+      <w:pPr>
+        <w:jc w:val="center"/>
+        <w:rPr>
+          <w:b/>
+          <w:bCs/>
+          <w:lang w:val="en-US"/>
+        </w:rPr>
+      </w:pPr>
+      <w:r>
+        <w:rPr>
+          <w:b/>
+          <w:bCs/>
+          <w:lang w:val="en-US"/>
+        </w:rPr>
         <w:t>From DSO (TD_RS) To CUBE (TD_RS_C)</w:t>
       </w:r>
     </w:p>
@@ -749,7 +1130,7 @@
                     </pic:cNvPicPr>
                   </pic:nvPicPr>
                   <pic:blipFill>
-                    <a:blip r:embed="rId6">
+                    <a:blip r:embed="rId7">
                       <a:extLst>
                         <a:ext uri="{28A0092B-C50C-407E-A947-70E740481C1C}">
                           <a14:useLocalDpi xmlns:a14="http://schemas.microsoft.com/office/drawing/2010/main" val="0"/>
@@ -811,7 +1192,10 @@
           <w:lang w:val="en-US"/>
         </w:rPr>
       </w:pPr>
-      <w:r>
+    </w:p>
+    <w:p>
+      <w:pPr>
+        <w:jc w:val="center"/>
         <w:rPr>
           <w:b/>
           <w:bCs/>
@@ -819,25 +1203,158 @@
           <w:szCs w:val="28"/>
           <w:lang w:val="en-US"/>
         </w:rPr>
-        <w:t>Transformations from Datasource to DSO</w:t>
-      </w:r>
-    </w:p>
-    <w:p>
-      <w:pPr>
-        <w:jc w:val="center"/>
-        <w:rPr>
-          <w:b/>
-          <w:bCs/>
-          <w:lang w:val="en-US"/>
-        </w:rPr>
-      </w:pPr>
-      <w:r>
-        <w:rPr>
-          <w:b/>
-          <w:bCs/>
-          <w:lang w:val="en-US"/>
-        </w:rPr>
-        <w:t>From Datasource (DS_IS_TD) To DSO (TD_IS)</w:t>
+      </w:pPr>
+    </w:p>
+    <w:p>
+      <w:pPr>
+        <w:jc w:val="center"/>
+        <w:rPr>
+          <w:b/>
+          <w:bCs/>
+          <w:sz w:val="28"/>
+          <w:szCs w:val="28"/>
+          <w:lang w:val="en-US"/>
+        </w:rPr>
+      </w:pPr>
+    </w:p>
+    <w:p>
+      <w:pPr>
+        <w:jc w:val="center"/>
+        <w:rPr>
+          <w:b/>
+          <w:bCs/>
+          <w:sz w:val="28"/>
+          <w:szCs w:val="28"/>
+          <w:lang w:val="en-US"/>
+        </w:rPr>
+      </w:pPr>
+    </w:p>
+    <w:p>
+      <w:pPr>
+        <w:jc w:val="center"/>
+        <w:rPr>
+          <w:b/>
+          <w:bCs/>
+          <w:sz w:val="28"/>
+          <w:szCs w:val="28"/>
+          <w:lang w:val="en-US"/>
+        </w:rPr>
+      </w:pPr>
+    </w:p>
+    <w:p>
+      <w:pPr>
+        <w:jc w:val="center"/>
+        <w:rPr>
+          <w:b/>
+          <w:bCs/>
+          <w:sz w:val="28"/>
+          <w:szCs w:val="28"/>
+          <w:lang w:val="en-US"/>
+        </w:rPr>
+      </w:pPr>
+    </w:p>
+    <w:p>
+      <w:pPr>
+        <w:jc w:val="center"/>
+        <w:rPr>
+          <w:b/>
+          <w:bCs/>
+          <w:sz w:val="28"/>
+          <w:szCs w:val="28"/>
+          <w:lang w:val="en-US"/>
+        </w:rPr>
+      </w:pPr>
+    </w:p>
+    <w:p>
+      <w:pPr>
+        <w:jc w:val="center"/>
+        <w:rPr>
+          <w:b/>
+          <w:bCs/>
+          <w:sz w:val="28"/>
+          <w:szCs w:val="28"/>
+          <w:lang w:val="en-US"/>
+        </w:rPr>
+      </w:pPr>
+    </w:p>
+    <w:p>
+      <w:pPr>
+        <w:jc w:val="center"/>
+        <w:rPr>
+          <w:b/>
+          <w:bCs/>
+          <w:sz w:val="28"/>
+          <w:szCs w:val="28"/>
+          <w:lang w:val="en-US"/>
+        </w:rPr>
+      </w:pPr>
+      <w:r>
+        <w:rPr>
+          <w:b/>
+          <w:bCs/>
+          <w:sz w:val="28"/>
+          <w:szCs w:val="28"/>
+          <w:lang w:val="en-US"/>
+        </w:rPr>
+        <w:t xml:space="preserve">Transformations from </w:t>
+      </w:r>
+      <w:proofErr w:type="spellStart"/>
+      <w:r>
+        <w:rPr>
+          <w:b/>
+          <w:bCs/>
+          <w:sz w:val="28"/>
+          <w:szCs w:val="28"/>
+          <w:lang w:val="en-US"/>
+        </w:rPr>
+        <w:t>Datasource</w:t>
+      </w:r>
+      <w:proofErr w:type="spellEnd"/>
+      <w:r>
+        <w:rPr>
+          <w:b/>
+          <w:bCs/>
+          <w:sz w:val="28"/>
+          <w:szCs w:val="28"/>
+          <w:lang w:val="en-US"/>
+        </w:rPr>
+        <w:t xml:space="preserve"> to DSO</w:t>
+      </w:r>
+    </w:p>
+    <w:p>
+      <w:pPr>
+        <w:jc w:val="center"/>
+        <w:rPr>
+          <w:b/>
+          <w:bCs/>
+          <w:lang w:val="en-US"/>
+        </w:rPr>
+      </w:pPr>
+      <w:r>
+        <w:rPr>
+          <w:b/>
+          <w:bCs/>
+          <w:lang w:val="en-US"/>
+        </w:rPr>
+        <w:t xml:space="preserve">From </w:t>
+      </w:r>
+      <w:proofErr w:type="spellStart"/>
+      <w:r>
+        <w:rPr>
+          <w:b/>
+          <w:bCs/>
+          <w:lang w:val="en-US"/>
+        </w:rPr>
+        <w:t>Datasource</w:t>
+      </w:r>
+      <w:proofErr w:type="spellEnd"/>
+      <w:r>
+        <w:rPr>
+          <w:b/>
+          <w:bCs/>
+          <w:lang w:val="en-US"/>
+        </w:rPr>
+        <w:t xml:space="preserve"> (DS_IS_TD) To DSO (TD_IS)</w:t>
       </w:r>
     </w:p>
     <w:p>
@@ -877,7 +1394,7 @@
                     </pic:cNvPicPr>
                   </pic:nvPicPr>
                   <pic:blipFill>
-                    <a:blip r:embed="rId7">
+                    <a:blip r:embed="rId8">
                       <a:extLst>
                         <a:ext uri="{28A0092B-C50C-407E-A947-70E740481C1C}">
                           <a14:useLocalDpi xmlns:a14="http://schemas.microsoft.com/office/drawing/2010/main" val="0"/>
@@ -930,6 +1447,86 @@
           <w:lang w:val="en-US"/>
         </w:rPr>
       </w:pPr>
+    </w:p>
+    <w:p>
+      <w:pPr>
+        <w:jc w:val="center"/>
+        <w:rPr>
+          <w:b/>
+          <w:bCs/>
+          <w:lang w:val="en-US"/>
+        </w:rPr>
+      </w:pPr>
+    </w:p>
+    <w:p>
+      <w:pPr>
+        <w:jc w:val="center"/>
+        <w:rPr>
+          <w:b/>
+          <w:bCs/>
+          <w:lang w:val="en-US"/>
+        </w:rPr>
+      </w:pPr>
+    </w:p>
+    <w:p>
+      <w:pPr>
+        <w:jc w:val="center"/>
+        <w:rPr>
+          <w:b/>
+          <w:bCs/>
+          <w:lang w:val="en-US"/>
+        </w:rPr>
+      </w:pPr>
+    </w:p>
+    <w:p>
+      <w:pPr>
+        <w:jc w:val="center"/>
+        <w:rPr>
+          <w:b/>
+          <w:bCs/>
+          <w:lang w:val="en-US"/>
+        </w:rPr>
+      </w:pPr>
+    </w:p>
+    <w:p>
+      <w:pPr>
+        <w:jc w:val="center"/>
+        <w:rPr>
+          <w:b/>
+          <w:bCs/>
+          <w:lang w:val="en-US"/>
+        </w:rPr>
+      </w:pPr>
+    </w:p>
+    <w:p>
+      <w:pPr>
+        <w:jc w:val="center"/>
+        <w:rPr>
+          <w:b/>
+          <w:bCs/>
+          <w:lang w:val="en-US"/>
+        </w:rPr>
+      </w:pPr>
+    </w:p>
+    <w:p>
+      <w:pPr>
+        <w:jc w:val="center"/>
+        <w:rPr>
+          <w:b/>
+          <w:bCs/>
+          <w:lang w:val="en-US"/>
+        </w:rPr>
+      </w:pPr>
+    </w:p>
+    <w:p>
+      <w:pPr>
+        <w:jc w:val="center"/>
+        <w:rPr>
+          <w:b/>
+          <w:bCs/>
+          <w:lang w:val="en-US"/>
+        </w:rPr>
+      </w:pPr>
       <w:r>
         <w:rPr>
           <w:b/>
@@ -937,7 +1534,25 @@
           <w:lang w:val="en-US"/>
         </w:rPr>
         <w:lastRenderedPageBreak/>
-        <w:t>From Datasource (DS_RS_TD) To DSO (TD_RS)</w:t>
+        <w:t xml:space="preserve">From </w:t>
+      </w:r>
+      <w:proofErr w:type="spellStart"/>
+      <w:r>
+        <w:rPr>
+          <w:b/>
+          <w:bCs/>
+          <w:lang w:val="en-US"/>
+        </w:rPr>
+        <w:t>Datasource</w:t>
+      </w:r>
+      <w:proofErr w:type="spellEnd"/>
+      <w:r>
+        <w:rPr>
+          <w:b/>
+          <w:bCs/>
+          <w:lang w:val="en-US"/>
+        </w:rPr>
+        <w:t xml:space="preserve"> (DS_RS_TD) To DSO (TD_RS)</w:t>
       </w:r>
     </w:p>
     <w:p>
@@ -974,7 +1589,7 @@
                     </pic:cNvPicPr>
                   </pic:nvPicPr>
                   <pic:blipFill>
-                    <a:blip r:embed="rId8">
+                    <a:blip r:embed="rId9">
                       <a:extLst>
                         <a:ext uri="{28A0092B-C50C-407E-A947-70E740481C1C}">
                           <a14:useLocalDpi xmlns:a14="http://schemas.microsoft.com/office/drawing/2010/main" val="0"/>
@@ -1042,7 +1657,10 @@
           <w:lang w:val="en-US"/>
         </w:rPr>
       </w:pPr>
-      <w:r>
+    </w:p>
+    <w:p>
+      <w:pPr>
+        <w:jc w:val="center"/>
         <w:rPr>
           <w:b/>
           <w:bCs/>
@@ -1050,8 +1668,51 @@
           <w:szCs w:val="28"/>
           <w:lang w:val="en-US"/>
         </w:rPr>
-        <w:t>Transformations from Datasource to Infoobject</w:t>
-      </w:r>
+      </w:pPr>
+      <w:r>
+        <w:rPr>
+          <w:b/>
+          <w:bCs/>
+          <w:sz w:val="28"/>
+          <w:szCs w:val="28"/>
+          <w:lang w:val="en-US"/>
+        </w:rPr>
+        <w:t xml:space="preserve">Transformations from </w:t>
+      </w:r>
+      <w:proofErr w:type="spellStart"/>
+      <w:r>
+        <w:rPr>
+          <w:b/>
+          <w:bCs/>
+          <w:sz w:val="28"/>
+          <w:szCs w:val="28"/>
+          <w:lang w:val="en-US"/>
+        </w:rPr>
+        <w:t>Datasource</w:t>
+      </w:r>
+      <w:proofErr w:type="spellEnd"/>
+      <w:r>
+        <w:rPr>
+          <w:b/>
+          <w:bCs/>
+          <w:sz w:val="28"/>
+          <w:szCs w:val="28"/>
+          <w:lang w:val="en-US"/>
+        </w:rPr>
+        <w:t xml:space="preserve"> to </w:t>
+      </w:r>
+      <w:proofErr w:type="spellStart"/>
+      <w:r>
+        <w:rPr>
+          <w:b/>
+          <w:bCs/>
+          <w:sz w:val="28"/>
+          <w:szCs w:val="28"/>
+          <w:lang w:val="en-US"/>
+        </w:rPr>
+        <w:t>Infoobject</w:t>
+      </w:r>
+      <w:proofErr w:type="spellEnd"/>
     </w:p>
     <w:p>
       <w:pPr>
@@ -1094,6 +1755,7 @@
         <w:rPr>
           <w:b/>
           <w:bCs/>
+          <w:noProof/>
           <w:lang w:val="en-US"/>
         </w:rPr>
         <w:drawing>
@@ -1112,7 +1774,7 @@
                     <pic:cNvPicPr/>
                   </pic:nvPicPr>
                   <pic:blipFill>
-                    <a:blip r:embed="rId9"/>
+                    <a:blip r:embed="rId10"/>
                     <a:stretch>
                       <a:fillRect/>
                     </a:stretch>
@@ -1158,31 +1820,23 @@
           <w:bCs/>
           <w:lang w:val="en-US"/>
         </w:rPr>
-        <w:lastRenderedPageBreak/>
-        <w:t xml:space="preserve">From DS to Customer MD (MD_CUS) – </w:t>
-      </w:r>
-      <w:r>
-        <w:rPr>
-          <w:b/>
-          <w:bCs/>
-          <w:lang w:val="en-US"/>
-        </w:rPr>
-        <w:t>Texts</w:t>
-      </w:r>
-    </w:p>
-    <w:p>
-      <w:pPr>
-        <w:jc w:val="center"/>
-        <w:rPr>
-          <w:b/>
-          <w:bCs/>
-          <w:lang w:val="en-US"/>
-        </w:rPr>
-      </w:pPr>
-      <w:r>
-        <w:rPr>
-          <w:b/>
-          <w:bCs/>
+        <w:t>From DS to Customer MD (MD_CUS) – Texts</w:t>
+      </w:r>
+    </w:p>
+    <w:p>
+      <w:pPr>
+        <w:jc w:val="center"/>
+        <w:rPr>
+          <w:b/>
+          <w:bCs/>
+          <w:lang w:val="en-US"/>
+        </w:rPr>
+      </w:pPr>
+      <w:r>
+        <w:rPr>
+          <w:b/>
+          <w:bCs/>
+          <w:noProof/>
           <w:lang w:val="en-US"/>
         </w:rPr>
         <w:drawing>
@@ -1201,7 +1855,7 @@
                     <pic:cNvPicPr/>
                   </pic:nvPicPr>
                   <pic:blipFill>
-                    <a:blip r:embed="rId10"/>
+                    <a:blip r:embed="rId11"/>
                     <a:stretch>
                       <a:fillRect/>
                     </a:stretch>
@@ -1254,6 +1908,36 @@
           <w:lang w:val="en-US"/>
         </w:rPr>
       </w:pPr>
+    </w:p>
+    <w:p>
+      <w:pPr>
+        <w:jc w:val="center"/>
+        <w:rPr>
+          <w:b/>
+          <w:bCs/>
+          <w:lang w:val="en-US"/>
+        </w:rPr>
+      </w:pPr>
+    </w:p>
+    <w:p>
+      <w:pPr>
+        <w:jc w:val="center"/>
+        <w:rPr>
+          <w:b/>
+          <w:bCs/>
+          <w:lang w:val="en-US"/>
+        </w:rPr>
+      </w:pPr>
+    </w:p>
+    <w:p>
+      <w:pPr>
+        <w:jc w:val="center"/>
+        <w:rPr>
+          <w:b/>
+          <w:bCs/>
+          <w:lang w:val="en-US"/>
+        </w:rPr>
+      </w:pPr>
       <w:r>
         <w:rPr>
           <w:b/>
@@ -1276,30 +1960,23 @@
           <w:bCs/>
           <w:lang w:val="en-US"/>
         </w:rPr>
-        <w:t xml:space="preserve"> – </w:t>
-      </w:r>
-      <w:r>
-        <w:rPr>
-          <w:b/>
-          <w:bCs/>
-          <w:lang w:val="en-US"/>
-        </w:rPr>
-        <w:t>Attributes</w:t>
-      </w:r>
-    </w:p>
-    <w:p>
-      <w:pPr>
-        <w:jc w:val="center"/>
-        <w:rPr>
-          <w:b/>
-          <w:bCs/>
-          <w:lang w:val="en-US"/>
-        </w:rPr>
-      </w:pPr>
-      <w:r>
-        <w:rPr>
-          <w:b/>
-          <w:bCs/>
+        <w:t xml:space="preserve"> – Attributes</w:t>
+      </w:r>
+    </w:p>
+    <w:p>
+      <w:pPr>
+        <w:jc w:val="center"/>
+        <w:rPr>
+          <w:b/>
+          <w:bCs/>
+          <w:lang w:val="en-US"/>
+        </w:rPr>
+      </w:pPr>
+      <w:r>
+        <w:rPr>
+          <w:b/>
+          <w:bCs/>
+          <w:noProof/>
           <w:lang w:val="en-US"/>
         </w:rPr>
         <w:drawing>
@@ -1318,7 +1995,7 @@
                     <pic:cNvPicPr/>
                   </pic:nvPicPr>
                   <pic:blipFill>
-                    <a:blip r:embed="rId11"/>
+                    <a:blip r:embed="rId12"/>
                     <a:stretch>
                       <a:fillRect/>
                     </a:stretch>
@@ -1370,30 +2047,23 @@
           <w:bCs/>
           <w:lang w:val="en-US"/>
         </w:rPr>
-        <w:t xml:space="preserve"> – </w:t>
-      </w:r>
-      <w:r>
-        <w:rPr>
-          <w:b/>
-          <w:bCs/>
-          <w:lang w:val="en-US"/>
-        </w:rPr>
-        <w:t>Texts</w:t>
-      </w:r>
-    </w:p>
-    <w:p>
-      <w:pPr>
-        <w:jc w:val="center"/>
-        <w:rPr>
-          <w:b/>
-          <w:bCs/>
-          <w:lang w:val="en-US"/>
-        </w:rPr>
-      </w:pPr>
-      <w:r>
-        <w:rPr>
-          <w:b/>
-          <w:bCs/>
+        <w:t xml:space="preserve"> – Texts</w:t>
+      </w:r>
+    </w:p>
+    <w:p>
+      <w:pPr>
+        <w:jc w:val="center"/>
+        <w:rPr>
+          <w:b/>
+          <w:bCs/>
+          <w:lang w:val="en-US"/>
+        </w:rPr>
+      </w:pPr>
+      <w:r>
+        <w:rPr>
+          <w:b/>
+          <w:bCs/>
+          <w:noProof/>
           <w:lang w:val="en-US"/>
         </w:rPr>
         <w:drawing>
@@ -1412,7 +2082,7 @@
                     <pic:cNvPicPr/>
                   </pic:nvPicPr>
                   <pic:blipFill>
-                    <a:blip r:embed="rId12"/>
+                    <a:blip r:embed="rId13"/>
                     <a:stretch>
                       <a:fillRect/>
                     </a:stretch>
@@ -1485,33 +2155,12 @@
           <w:lang w:val="en-US"/>
         </w:rPr>
       </w:pPr>
-    </w:p>
-    <w:p>
-      <w:pPr>
-        <w:jc w:val="center"/>
-        <w:rPr>
-          <w:b/>
-          <w:bCs/>
-          <w:lang w:val="en-US"/>
-        </w:rPr>
-      </w:pPr>
-    </w:p>
-    <w:p>
-      <w:pPr>
-        <w:jc w:val="center"/>
-        <w:rPr>
-          <w:b/>
-          <w:bCs/>
-          <w:lang w:val="en-US"/>
-        </w:rPr>
-      </w:pPr>
-      <w:r>
-        <w:rPr>
-          <w:b/>
-          <w:bCs/>
-          <w:lang w:val="en-US"/>
-        </w:rPr>
-        <w:lastRenderedPageBreak/>
+      <w:r>
+        <w:rPr>
+          <w:b/>
+          <w:bCs/>
+          <w:lang w:val="en-US"/>
+        </w:rPr>
         <w:t xml:space="preserve">From </w:t>
       </w:r>
       <w:r>
@@ -1560,6 +2209,7 @@
         <w:rPr>
           <w:b/>
           <w:bCs/>
+          <w:noProof/>
           <w:lang w:val="en-US"/>
         </w:rPr>
         <w:drawing>
@@ -1578,7 +2228,7 @@
                     <pic:cNvPicPr/>
                   </pic:nvPicPr>
                   <pic:blipFill>
-                    <a:blip r:embed="rId13"/>
+                    <a:blip r:embed="rId14"/>
                     <a:stretch>
                       <a:fillRect/>
                     </a:stretch>
@@ -1608,6 +2258,16 @@
           <w:lang w:val="en-US"/>
         </w:rPr>
       </w:pPr>
+    </w:p>
+    <w:p>
+      <w:pPr>
+        <w:jc w:val="center"/>
+        <w:rPr>
+          <w:b/>
+          <w:bCs/>
+          <w:lang w:val="en-US"/>
+        </w:rPr>
+      </w:pPr>
       <w:r>
         <w:rPr>
           <w:b/>
@@ -1646,6 +2306,7 @@
         <w:rPr>
           <w:b/>
           <w:bCs/>
+          <w:noProof/>
           <w:lang w:val="en-US"/>
         </w:rPr>
         <w:drawing>
@@ -1664,7 +2325,7 @@
                     <pic:cNvPicPr/>
                   </pic:nvPicPr>
                   <pic:blipFill>
-                    <a:blip r:embed="rId14"/>
+                    <a:blip r:embed="rId15"/>
                     <a:stretch>
                       <a:fillRect/>
                     </a:stretch>
@@ -1745,6 +2406,7 @@
         <w:rPr>
           <w:b/>
           <w:bCs/>
+          <w:noProof/>
           <w:lang w:val="en-US"/>
         </w:rPr>
         <w:drawing>
@@ -1763,7 +2425,7 @@
                     <pic:cNvPicPr/>
                   </pic:nvPicPr>
                   <pic:blipFill>
-                    <a:blip r:embed="rId15"/>
+                    <a:blip r:embed="rId16"/>
                     <a:stretch>
                       <a:fillRect/>
                     </a:stretch>
@@ -1862,7 +2524,6 @@
           <w:bCs/>
           <w:lang w:val="en-US"/>
         </w:rPr>
-        <w:lastRenderedPageBreak/>
         <w:t xml:space="preserve">From </w:t>
       </w:r>
       <w:r>
@@ -1919,6 +2580,7 @@
         <w:rPr>
           <w:b/>
           <w:bCs/>
+          <w:noProof/>
           <w:lang w:val="en-US"/>
         </w:rPr>
         <w:drawing>
@@ -1937,7 +2599,7 @@
                     <pic:cNvPicPr/>
                   </pic:nvPicPr>
                   <pic:blipFill>
-                    <a:blip r:embed="rId16"/>
+                    <a:blip r:embed="rId17"/>
                     <a:stretch>
                       <a:fillRect/>
                     </a:stretch>
@@ -2013,30 +2675,23 @@
           <w:bCs/>
           <w:lang w:val="en-US"/>
         </w:rPr>
-        <w:t xml:space="preserve"> – </w:t>
-      </w:r>
-      <w:r>
-        <w:rPr>
-          <w:b/>
-          <w:bCs/>
-          <w:lang w:val="en-US"/>
-        </w:rPr>
-        <w:t>Texts</w:t>
-      </w:r>
-    </w:p>
-    <w:p>
-      <w:pPr>
-        <w:jc w:val="center"/>
-        <w:rPr>
-          <w:b/>
-          <w:bCs/>
-          <w:lang w:val="en-US"/>
-        </w:rPr>
-      </w:pPr>
-      <w:r>
-        <w:rPr>
-          <w:b/>
-          <w:bCs/>
+        <w:t xml:space="preserve"> – Texts</w:t>
+      </w:r>
+    </w:p>
+    <w:p>
+      <w:pPr>
+        <w:jc w:val="center"/>
+        <w:rPr>
+          <w:b/>
+          <w:bCs/>
+          <w:lang w:val="en-US"/>
+        </w:rPr>
+      </w:pPr>
+      <w:r>
+        <w:rPr>
+          <w:b/>
+          <w:bCs/>
+          <w:noProof/>
           <w:lang w:val="en-US"/>
         </w:rPr>
         <w:drawing>
@@ -2055,7 +2710,7 @@
                     <pic:cNvPicPr/>
                   </pic:nvPicPr>
                   <pic:blipFill>
-                    <a:blip r:embed="rId17"/>
+                    <a:blip r:embed="rId18"/>
                     <a:stretch>
                       <a:fillRect/>
                     </a:stretch>
@@ -2160,6 +2815,7 @@
         <w:rPr>
           <w:b/>
           <w:bCs/>
+          <w:noProof/>
           <w:lang w:val="en-US"/>
         </w:rPr>
         <w:drawing>
@@ -2178,7 +2834,7 @@
                     <pic:cNvPicPr/>
                   </pic:nvPicPr>
                   <pic:blipFill>
-                    <a:blip r:embed="rId18"/>
+                    <a:blip r:embed="rId19"/>
                     <a:stretch>
                       <a:fillRect/>
                     </a:stretch>
@@ -2244,7 +2900,6 @@
           <w:bCs/>
           <w:lang w:val="en-US"/>
         </w:rPr>
-        <w:lastRenderedPageBreak/>
         <w:t xml:space="preserve">From </w:t>
       </w:r>
       <w:r>
@@ -2285,30 +2940,23 @@
           <w:bCs/>
           <w:lang w:val="en-US"/>
         </w:rPr>
-        <w:t xml:space="preserve"> – </w:t>
-      </w:r>
-      <w:r>
-        <w:rPr>
-          <w:b/>
-          <w:bCs/>
-          <w:lang w:val="en-US"/>
-        </w:rPr>
-        <w:t>Texts</w:t>
-      </w:r>
-    </w:p>
-    <w:p>
-      <w:pPr>
-        <w:jc w:val="center"/>
-        <w:rPr>
-          <w:b/>
-          <w:bCs/>
-          <w:lang w:val="en-US"/>
-        </w:rPr>
-      </w:pPr>
-      <w:r>
-        <w:rPr>
-          <w:b/>
-          <w:bCs/>
+        <w:t xml:space="preserve"> – Texts</w:t>
+      </w:r>
+    </w:p>
+    <w:p>
+      <w:pPr>
+        <w:jc w:val="center"/>
+        <w:rPr>
+          <w:b/>
+          <w:bCs/>
+          <w:lang w:val="en-US"/>
+        </w:rPr>
+      </w:pPr>
+      <w:r>
+        <w:rPr>
+          <w:b/>
+          <w:bCs/>
+          <w:noProof/>
           <w:lang w:val="en-US"/>
         </w:rPr>
         <w:drawing>
@@ -2327,7 +2975,7 @@
                     <pic:cNvPicPr/>
                   </pic:nvPicPr>
                   <pic:blipFill>
-                    <a:blip r:embed="rId19"/>
+                    <a:blip r:embed="rId20"/>
                     <a:stretch>
                       <a:fillRect/>
                     </a:stretch>
@@ -2380,6 +3028,16 @@
           <w:lang w:val="en-US"/>
         </w:rPr>
       </w:pPr>
+    </w:p>
+    <w:p>
+      <w:pPr>
+        <w:jc w:val="center"/>
+        <w:rPr>
+          <w:b/>
+          <w:bCs/>
+          <w:lang w:val="en-US"/>
+        </w:rPr>
+      </w:pPr>
       <w:r>
         <w:rPr>
           <w:b/>
@@ -2418,15 +3076,7 @@
           <w:bCs/>
           <w:lang w:val="en-US"/>
         </w:rPr>
-        <w:t>Promotion MD (MD_PROM)</w:t>
-      </w:r>
-      <w:r>
-        <w:rPr>
-          <w:b/>
-          <w:bCs/>
-          <w:lang w:val="en-US"/>
-        </w:rPr>
-        <w:t xml:space="preserve"> </w:t>
+        <w:t xml:space="preserve">Promotion MD (MD_PROM) </w:t>
       </w:r>
       <w:r>
         <w:rPr>
@@ -2450,6 +3100,7 @@
         <w:rPr>
           <w:b/>
           <w:bCs/>
+          <w:noProof/>
           <w:lang w:val="en-US"/>
         </w:rPr>
         <w:drawing>
@@ -2468,7 +3119,7 @@
                     <pic:cNvPicPr/>
                   </pic:nvPicPr>
                   <pic:blipFill>
-                    <a:blip r:embed="rId20"/>
+                    <a:blip r:embed="rId21"/>
                     <a:stretch>
                       <a:fillRect/>
                     </a:stretch>
@@ -2544,30 +3195,23 @@
           <w:bCs/>
           <w:lang w:val="en-US"/>
         </w:rPr>
-        <w:t xml:space="preserve">– </w:t>
-      </w:r>
-      <w:r>
-        <w:rPr>
-          <w:b/>
-          <w:bCs/>
-          <w:lang w:val="en-US"/>
-        </w:rPr>
-        <w:t>Texts</w:t>
-      </w:r>
-    </w:p>
-    <w:p>
-      <w:pPr>
-        <w:jc w:val="center"/>
-        <w:rPr>
-          <w:b/>
-          <w:bCs/>
-          <w:lang w:val="en-US"/>
-        </w:rPr>
-      </w:pPr>
-      <w:r>
-        <w:rPr>
-          <w:b/>
-          <w:bCs/>
+        <w:t>– Texts</w:t>
+      </w:r>
+    </w:p>
+    <w:p>
+      <w:pPr>
+        <w:jc w:val="center"/>
+        <w:rPr>
+          <w:b/>
+          <w:bCs/>
+          <w:lang w:val="en-US"/>
+        </w:rPr>
+      </w:pPr>
+      <w:r>
+        <w:rPr>
+          <w:b/>
+          <w:bCs/>
+          <w:noProof/>
           <w:lang w:val="en-US"/>
         </w:rPr>
         <w:drawing>
@@ -2586,7 +3230,7 @@
                     <pic:cNvPicPr/>
                   </pic:nvPicPr>
                   <pic:blipFill>
-                    <a:blip r:embed="rId21"/>
+                    <a:blip r:embed="rId22"/>
                     <a:stretch>
                       <a:fillRect/>
                     </a:stretch>
@@ -2649,23 +3293,12 @@
           <w:lang w:val="en-US"/>
         </w:rPr>
       </w:pPr>
-    </w:p>
-    <w:p>
-      <w:pPr>
-        <w:jc w:val="center"/>
-        <w:rPr>
-          <w:b/>
-          <w:bCs/>
-          <w:lang w:val="en-US"/>
-        </w:rPr>
-      </w:pPr>
-      <w:r>
-        <w:rPr>
-          <w:b/>
-          <w:bCs/>
-          <w:lang w:val="en-US"/>
-        </w:rPr>
-        <w:lastRenderedPageBreak/>
+      <w:r>
+        <w:rPr>
+          <w:b/>
+          <w:bCs/>
+          <w:lang w:val="en-US"/>
+        </w:rPr>
         <w:t xml:space="preserve">From </w:t>
       </w:r>
       <w:r>
@@ -2730,6 +3363,7 @@
         <w:rPr>
           <w:b/>
           <w:bCs/>
+          <w:noProof/>
           <w:lang w:val="en-US"/>
         </w:rPr>
         <w:drawing>
@@ -2748,7 +3382,7 @@
                     <pic:cNvPicPr/>
                   </pic:nvPicPr>
                   <pic:blipFill>
-                    <a:blip r:embed="rId22"/>
+                    <a:blip r:embed="rId23"/>
                     <a:stretch>
                       <a:fillRect/>
                     </a:stretch>
@@ -2832,30 +3466,23 @@
           <w:bCs/>
           <w:lang w:val="en-US"/>
         </w:rPr>
-        <w:t xml:space="preserve">– </w:t>
-      </w:r>
-      <w:r>
-        <w:rPr>
-          <w:b/>
-          <w:bCs/>
-          <w:lang w:val="en-US"/>
-        </w:rPr>
-        <w:t>Texts</w:t>
-      </w:r>
-    </w:p>
-    <w:p>
-      <w:pPr>
-        <w:jc w:val="center"/>
-        <w:rPr>
-          <w:b/>
-          <w:bCs/>
-          <w:lang w:val="en-US"/>
-        </w:rPr>
-      </w:pPr>
-      <w:r>
-        <w:rPr>
-          <w:b/>
-          <w:bCs/>
+        <w:t>– Texts</w:t>
+      </w:r>
+    </w:p>
+    <w:p>
+      <w:pPr>
+        <w:jc w:val="center"/>
+        <w:rPr>
+          <w:b/>
+          <w:bCs/>
+          <w:lang w:val="en-US"/>
+        </w:rPr>
+      </w:pPr>
+      <w:r>
+        <w:rPr>
+          <w:b/>
+          <w:bCs/>
+          <w:noProof/>
           <w:lang w:val="en-US"/>
         </w:rPr>
         <w:drawing>
@@ -2874,7 +3501,7 @@
                     <pic:cNvPicPr/>
                   </pic:nvPicPr>
                   <pic:blipFill>
-                    <a:blip r:embed="rId23"/>
+                    <a:blip r:embed="rId24"/>
                     <a:stretch>
                       <a:fillRect/>
                     </a:stretch>
@@ -2917,12 +3544,63 @@
           <w:lang w:val="en-US"/>
         </w:rPr>
       </w:pPr>
-      <w:r>
-        <w:rPr>
-          <w:b/>
-          <w:bCs/>
-          <w:lang w:val="en-US"/>
-        </w:rPr>
+    </w:p>
+    <w:p>
+      <w:pPr>
+        <w:jc w:val="center"/>
+        <w:rPr>
+          <w:b/>
+          <w:bCs/>
+          <w:lang w:val="en-US"/>
+        </w:rPr>
+      </w:pPr>
+    </w:p>
+    <w:p>
+      <w:pPr>
+        <w:jc w:val="center"/>
+        <w:rPr>
+          <w:b/>
+          <w:bCs/>
+          <w:lang w:val="en-US"/>
+        </w:rPr>
+      </w:pPr>
+    </w:p>
+    <w:p>
+      <w:pPr>
+        <w:jc w:val="center"/>
+        <w:rPr>
+          <w:b/>
+          <w:bCs/>
+          <w:lang w:val="en-US"/>
+        </w:rPr>
+      </w:pPr>
+    </w:p>
+    <w:p>
+      <w:pPr>
+        <w:jc w:val="center"/>
+        <w:rPr>
+          <w:b/>
+          <w:bCs/>
+          <w:lang w:val="en-US"/>
+        </w:rPr>
+      </w:pPr>
+    </w:p>
+    <w:p>
+      <w:pPr>
+        <w:jc w:val="center"/>
+        <w:rPr>
+          <w:b/>
+          <w:bCs/>
+          <w:lang w:val="en-US"/>
+        </w:rPr>
+      </w:pPr>
+      <w:r>
+        <w:rPr>
+          <w:b/>
+          <w:bCs/>
+          <w:lang w:val="en-US"/>
+        </w:rPr>
+        <w:lastRenderedPageBreak/>
         <w:t xml:space="preserve">From </w:t>
       </w:r>
       <w:r>
@@ -2987,6 +3665,7 @@
         <w:rPr>
           <w:b/>
           <w:bCs/>
+          <w:noProof/>
           <w:lang w:val="en-US"/>
         </w:rPr>
         <w:drawing>
@@ -3005,7 +3684,7 @@
                     <pic:cNvPicPr/>
                   </pic:nvPicPr>
                   <pic:blipFill>
-                    <a:blip r:embed="rId24"/>
+                    <a:blip r:embed="rId25"/>
                     <a:stretch>
                       <a:fillRect/>
                     </a:stretch>
@@ -3045,13 +3724,22 @@
           <w:lang w:val="en-US"/>
         </w:rPr>
       </w:pPr>
-      <w:r>
-        <w:rPr>
-          <w:b/>
-          <w:bCs/>
-          <w:lang w:val="en-US"/>
-        </w:rPr>
-        <w:lastRenderedPageBreak/>
+    </w:p>
+    <w:p>
+      <w:pPr>
+        <w:jc w:val="center"/>
+        <w:rPr>
+          <w:b/>
+          <w:bCs/>
+          <w:lang w:val="en-US"/>
+        </w:rPr>
+      </w:pPr>
+      <w:r>
+        <w:rPr>
+          <w:b/>
+          <w:bCs/>
+          <w:lang w:val="en-US"/>
+        </w:rPr>
         <w:t xml:space="preserve">From </w:t>
       </w:r>
       <w:r>
@@ -3100,30 +3788,23 @@
           <w:bCs/>
           <w:lang w:val="en-US"/>
         </w:rPr>
-        <w:t xml:space="preserve">– </w:t>
-      </w:r>
-      <w:r>
-        <w:rPr>
-          <w:b/>
-          <w:bCs/>
-          <w:lang w:val="en-US"/>
-        </w:rPr>
-        <w:t>Texts</w:t>
-      </w:r>
-    </w:p>
-    <w:p>
-      <w:pPr>
-        <w:jc w:val="center"/>
-        <w:rPr>
-          <w:b/>
-          <w:bCs/>
-          <w:lang w:val="en-US"/>
-        </w:rPr>
-      </w:pPr>
-      <w:r>
-        <w:rPr>
-          <w:b/>
-          <w:bCs/>
+        <w:t>– Texts</w:t>
+      </w:r>
+    </w:p>
+    <w:p>
+      <w:pPr>
+        <w:jc w:val="center"/>
+        <w:rPr>
+          <w:b/>
+          <w:bCs/>
+          <w:lang w:val="en-US"/>
+        </w:rPr>
+      </w:pPr>
+      <w:r>
+        <w:rPr>
+          <w:b/>
+          <w:bCs/>
+          <w:noProof/>
           <w:lang w:val="en-US"/>
         </w:rPr>
         <w:drawing>
@@ -3142,7 +3823,7 @@
                     <pic:cNvPicPr/>
                   </pic:nvPicPr>
                   <pic:blipFill>
-                    <a:blip r:embed="rId25"/>
+                    <a:blip r:embed="rId26"/>
                     <a:stretch>
                       <a:fillRect/>
                     </a:stretch>
@@ -3223,15 +3904,7 @@
           <w:bCs/>
           <w:lang w:val="en-US"/>
         </w:rPr>
-        <w:t>Currency MD (MD_CURR)</w:t>
-      </w:r>
-      <w:r>
-        <w:rPr>
-          <w:b/>
-          <w:bCs/>
-          <w:lang w:val="en-US"/>
-        </w:rPr>
-        <w:t xml:space="preserve"> </w:t>
+        <w:t xml:space="preserve">Currency MD (MD_CURR) </w:t>
       </w:r>
       <w:r>
         <w:rPr>
@@ -3255,6 +3928,7 @@
         <w:rPr>
           <w:b/>
           <w:bCs/>
+          <w:noProof/>
           <w:lang w:val="en-US"/>
         </w:rPr>
         <w:drawing>
@@ -3273,7 +3947,7 @@
                     <pic:cNvPicPr/>
                   </pic:nvPicPr>
                   <pic:blipFill>
-                    <a:blip r:embed="rId26"/>
+                    <a:blip r:embed="rId27"/>
                     <a:stretch>
                       <a:fillRect/>
                     </a:stretch>
@@ -3322,6 +3996,1531 @@
     </w:sectPr>
   </w:body>
 </w:document>
+</file>
+
+<file path=word/numbering.xml><?xml version="1.0" encoding="utf-8"?>
+<w:numbering xmlns:wpc="http://schemas.microsoft.com/office/word/2010/wordprocessingCanvas" xmlns:cx="http://schemas.microsoft.com/office/drawing/2014/chartex" xmlns:cx1="http://schemas.microsoft.com/office/drawing/2015/9/8/chartex" xmlns:cx2="http://schemas.microsoft.com/office/drawing/2015/10/21/chartex" xmlns:cx3="http://schemas.microsoft.com/office/drawing/2016/5/9/chartex" xmlns:cx4="http://schemas.microsoft.com/office/drawing/2016/5/10/chartex" xmlns:cx5="http://schemas.microsoft.com/office/drawing/2016/5/11/chartex" xmlns:cx6="http://schemas.microsoft.com/office/drawing/2016/5/12/chartex" xmlns:cx7="http://schemas.microsoft.com/office/drawing/2016/5/13/chartex" xmlns:cx8="http://schemas.microsoft.com/office/drawing/2016/5/14/chartex" xmlns:mc="http://schemas.openxmlformats.org/markup-compatibility/2006" xmlns:aink="http://schemas.microsoft.com/office/drawing/2016/ink" xmlns:am3d="http://schemas.microsoft.com/office/drawing/2017/model3d" xmlns:o="urn:schemas-microsoft-com:office:office" xmlns:oel="http://schemas.microsoft.com/office/2019/extlst" xmlns:r="http://schemas.openxmlformats.org/officeDocument/2006/relationships" xmlns:m="http://schemas.openxmlformats.org/officeDocument/2006/math" xmlns:v="urn:schemas-microsoft-com:vml" xmlns:wp14="http://schemas.microsoft.com/office/word/2010/wordprocessingDrawing" xmlns:wp="http://schemas.openxmlformats.org/drawingml/2006/wordprocessingDrawing" xmlns:w10="urn:schemas-microsoft-com:office:word" xmlns:w="http://schemas.openxmlformats.org/wordprocessingml/2006/main" xmlns:w14="http://schemas.microsoft.com/office/word/2010/wordml" xmlns:w15="http://schemas.microsoft.com/office/word/2012/wordml" xmlns:w16cex="http://schemas.microsoft.com/office/word/2018/wordml/cex" xmlns:w16cid="http://schemas.microsoft.com/office/word/2016/wordml/cid" xmlns:w16="http://schemas.microsoft.com/office/word/2018/wordml" xmlns:w16du="http://schemas.microsoft.com/office/word/2023/wordml/word16du" xmlns:w16sdtdh="http://schemas.microsoft.com/office/word/2020/wordml/sdtdatahash" xmlns:w16sdtfl="http://schemas.microsoft.com/office/word/2024/wordml/sdtformatlock" xmlns:w16se="http://schemas.microsoft.com/office/word/2015/wordml/symex" xmlns:wpg="http://schemas.microsoft.com/office/word/2010/wordprocessingGroup" xmlns:wpi="http://schemas.microsoft.com/office/word/2010/wordprocessingInk" xmlns:wne="http://schemas.microsoft.com/office/word/2006/wordml" xmlns:wps="http://schemas.microsoft.com/office/word/2010/wordprocessingShape" mc:Ignorable="w14 w15 w16se w16cid w16 w16cex w16sdtdh w16sdtfl w16du wp14">
+  <w:abstractNum w:abstractNumId="0" w15:restartNumberingAfterBreak="0">
+    <w:nsid w:val="061B56B1"/>
+    <w:multiLevelType w:val="multilevel"/>
+    <w:tmpl w:val="3500CA52"/>
+    <w:lvl w:ilvl="0">
+      <w:start w:val="1"/>
+      <w:numFmt w:val="bullet"/>
+      <w:lvlText w:val=""/>
+      <w:lvlJc w:val="left"/>
+      <w:pPr>
+        <w:tabs>
+          <w:tab w:val="num" w:pos="720"/>
+        </w:tabs>
+        <w:ind w:left="720" w:hanging="360"/>
+      </w:pPr>
+      <w:rPr>
+        <w:rFonts w:ascii="Symbol" w:hAnsi="Symbol" w:hint="default"/>
+        <w:sz w:val="20"/>
+      </w:rPr>
+    </w:lvl>
+    <w:lvl w:ilvl="1" w:tentative="1">
+      <w:start w:val="1"/>
+      <w:numFmt w:val="bullet"/>
+      <w:lvlText w:val="o"/>
+      <w:lvlJc w:val="left"/>
+      <w:pPr>
+        <w:tabs>
+          <w:tab w:val="num" w:pos="1440"/>
+        </w:tabs>
+        <w:ind w:left="1440" w:hanging="360"/>
+      </w:pPr>
+      <w:rPr>
+        <w:rFonts w:ascii="Courier New" w:hAnsi="Courier New" w:hint="default"/>
+        <w:sz w:val="20"/>
+      </w:rPr>
+    </w:lvl>
+    <w:lvl w:ilvl="2" w:tentative="1">
+      <w:start w:val="1"/>
+      <w:numFmt w:val="bullet"/>
+      <w:lvlText w:val=""/>
+      <w:lvlJc w:val="left"/>
+      <w:pPr>
+        <w:tabs>
+          <w:tab w:val="num" w:pos="2160"/>
+        </w:tabs>
+        <w:ind w:left="2160" w:hanging="360"/>
+      </w:pPr>
+      <w:rPr>
+        <w:rFonts w:ascii="Wingdings" w:hAnsi="Wingdings" w:hint="default"/>
+        <w:sz w:val="20"/>
+      </w:rPr>
+    </w:lvl>
+    <w:lvl w:ilvl="3" w:tentative="1">
+      <w:start w:val="1"/>
+      <w:numFmt w:val="bullet"/>
+      <w:lvlText w:val=""/>
+      <w:lvlJc w:val="left"/>
+      <w:pPr>
+        <w:tabs>
+          <w:tab w:val="num" w:pos="2880"/>
+        </w:tabs>
+        <w:ind w:left="2880" w:hanging="360"/>
+      </w:pPr>
+      <w:rPr>
+        <w:rFonts w:ascii="Wingdings" w:hAnsi="Wingdings" w:hint="default"/>
+        <w:sz w:val="20"/>
+      </w:rPr>
+    </w:lvl>
+    <w:lvl w:ilvl="4" w:tentative="1">
+      <w:start w:val="1"/>
+      <w:numFmt w:val="bullet"/>
+      <w:lvlText w:val=""/>
+      <w:lvlJc w:val="left"/>
+      <w:pPr>
+        <w:tabs>
+          <w:tab w:val="num" w:pos="3600"/>
+        </w:tabs>
+        <w:ind w:left="3600" w:hanging="360"/>
+      </w:pPr>
+      <w:rPr>
+        <w:rFonts w:ascii="Wingdings" w:hAnsi="Wingdings" w:hint="default"/>
+        <w:sz w:val="20"/>
+      </w:rPr>
+    </w:lvl>
+    <w:lvl w:ilvl="5" w:tentative="1">
+      <w:start w:val="1"/>
+      <w:numFmt w:val="bullet"/>
+      <w:lvlText w:val=""/>
+      <w:lvlJc w:val="left"/>
+      <w:pPr>
+        <w:tabs>
+          <w:tab w:val="num" w:pos="4320"/>
+        </w:tabs>
+        <w:ind w:left="4320" w:hanging="360"/>
+      </w:pPr>
+      <w:rPr>
+        <w:rFonts w:ascii="Wingdings" w:hAnsi="Wingdings" w:hint="default"/>
+        <w:sz w:val="20"/>
+      </w:rPr>
+    </w:lvl>
+    <w:lvl w:ilvl="6" w:tentative="1">
+      <w:start w:val="1"/>
+      <w:numFmt w:val="bullet"/>
+      <w:lvlText w:val=""/>
+      <w:lvlJc w:val="left"/>
+      <w:pPr>
+        <w:tabs>
+          <w:tab w:val="num" w:pos="5040"/>
+        </w:tabs>
+        <w:ind w:left="5040" w:hanging="360"/>
+      </w:pPr>
+      <w:rPr>
+        <w:rFonts w:ascii="Wingdings" w:hAnsi="Wingdings" w:hint="default"/>
+        <w:sz w:val="20"/>
+      </w:rPr>
+    </w:lvl>
+    <w:lvl w:ilvl="7" w:tentative="1">
+      <w:start w:val="1"/>
+      <w:numFmt w:val="bullet"/>
+      <w:lvlText w:val=""/>
+      <w:lvlJc w:val="left"/>
+      <w:pPr>
+        <w:tabs>
+          <w:tab w:val="num" w:pos="5760"/>
+        </w:tabs>
+        <w:ind w:left="5760" w:hanging="360"/>
+      </w:pPr>
+      <w:rPr>
+        <w:rFonts w:ascii="Wingdings" w:hAnsi="Wingdings" w:hint="default"/>
+        <w:sz w:val="20"/>
+      </w:rPr>
+    </w:lvl>
+    <w:lvl w:ilvl="8" w:tentative="1">
+      <w:start w:val="1"/>
+      <w:numFmt w:val="bullet"/>
+      <w:lvlText w:val=""/>
+      <w:lvlJc w:val="left"/>
+      <w:pPr>
+        <w:tabs>
+          <w:tab w:val="num" w:pos="6480"/>
+        </w:tabs>
+        <w:ind w:left="6480" w:hanging="360"/>
+      </w:pPr>
+      <w:rPr>
+        <w:rFonts w:ascii="Wingdings" w:hAnsi="Wingdings" w:hint="default"/>
+        <w:sz w:val="20"/>
+      </w:rPr>
+    </w:lvl>
+  </w:abstractNum>
+  <w:abstractNum w:abstractNumId="1" w15:restartNumberingAfterBreak="0">
+    <w:nsid w:val="333B0D3D"/>
+    <w:multiLevelType w:val="multilevel"/>
+    <w:tmpl w:val="20721F3C"/>
+    <w:lvl w:ilvl="0">
+      <w:start w:val="1"/>
+      <w:numFmt w:val="bullet"/>
+      <w:lvlText w:val=""/>
+      <w:lvlJc w:val="left"/>
+      <w:pPr>
+        <w:tabs>
+          <w:tab w:val="num" w:pos="720"/>
+        </w:tabs>
+        <w:ind w:left="720" w:hanging="360"/>
+      </w:pPr>
+      <w:rPr>
+        <w:rFonts w:ascii="Symbol" w:hAnsi="Symbol" w:hint="default"/>
+        <w:sz w:val="20"/>
+      </w:rPr>
+    </w:lvl>
+    <w:lvl w:ilvl="1" w:tentative="1">
+      <w:start w:val="1"/>
+      <w:numFmt w:val="bullet"/>
+      <w:lvlText w:val="o"/>
+      <w:lvlJc w:val="left"/>
+      <w:pPr>
+        <w:tabs>
+          <w:tab w:val="num" w:pos="1440"/>
+        </w:tabs>
+        <w:ind w:left="1440" w:hanging="360"/>
+      </w:pPr>
+      <w:rPr>
+        <w:rFonts w:ascii="Courier New" w:hAnsi="Courier New" w:hint="default"/>
+        <w:sz w:val="20"/>
+      </w:rPr>
+    </w:lvl>
+    <w:lvl w:ilvl="2" w:tentative="1">
+      <w:start w:val="1"/>
+      <w:numFmt w:val="bullet"/>
+      <w:lvlText w:val=""/>
+      <w:lvlJc w:val="left"/>
+      <w:pPr>
+        <w:tabs>
+          <w:tab w:val="num" w:pos="2160"/>
+        </w:tabs>
+        <w:ind w:left="2160" w:hanging="360"/>
+      </w:pPr>
+      <w:rPr>
+        <w:rFonts w:ascii="Wingdings" w:hAnsi="Wingdings" w:hint="default"/>
+        <w:sz w:val="20"/>
+      </w:rPr>
+    </w:lvl>
+    <w:lvl w:ilvl="3" w:tentative="1">
+      <w:start w:val="1"/>
+      <w:numFmt w:val="bullet"/>
+      <w:lvlText w:val=""/>
+      <w:lvlJc w:val="left"/>
+      <w:pPr>
+        <w:tabs>
+          <w:tab w:val="num" w:pos="2880"/>
+        </w:tabs>
+        <w:ind w:left="2880" w:hanging="360"/>
+      </w:pPr>
+      <w:rPr>
+        <w:rFonts w:ascii="Wingdings" w:hAnsi="Wingdings" w:hint="default"/>
+        <w:sz w:val="20"/>
+      </w:rPr>
+    </w:lvl>
+    <w:lvl w:ilvl="4" w:tentative="1">
+      <w:start w:val="1"/>
+      <w:numFmt w:val="bullet"/>
+      <w:lvlText w:val=""/>
+      <w:lvlJc w:val="left"/>
+      <w:pPr>
+        <w:tabs>
+          <w:tab w:val="num" w:pos="3600"/>
+        </w:tabs>
+        <w:ind w:left="3600" w:hanging="360"/>
+      </w:pPr>
+      <w:rPr>
+        <w:rFonts w:ascii="Wingdings" w:hAnsi="Wingdings" w:hint="default"/>
+        <w:sz w:val="20"/>
+      </w:rPr>
+    </w:lvl>
+    <w:lvl w:ilvl="5" w:tentative="1">
+      <w:start w:val="1"/>
+      <w:numFmt w:val="bullet"/>
+      <w:lvlText w:val=""/>
+      <w:lvlJc w:val="left"/>
+      <w:pPr>
+        <w:tabs>
+          <w:tab w:val="num" w:pos="4320"/>
+        </w:tabs>
+        <w:ind w:left="4320" w:hanging="360"/>
+      </w:pPr>
+      <w:rPr>
+        <w:rFonts w:ascii="Wingdings" w:hAnsi="Wingdings" w:hint="default"/>
+        <w:sz w:val="20"/>
+      </w:rPr>
+    </w:lvl>
+    <w:lvl w:ilvl="6" w:tentative="1">
+      <w:start w:val="1"/>
+      <w:numFmt w:val="bullet"/>
+      <w:lvlText w:val=""/>
+      <w:lvlJc w:val="left"/>
+      <w:pPr>
+        <w:tabs>
+          <w:tab w:val="num" w:pos="5040"/>
+        </w:tabs>
+        <w:ind w:left="5040" w:hanging="360"/>
+      </w:pPr>
+      <w:rPr>
+        <w:rFonts w:ascii="Wingdings" w:hAnsi="Wingdings" w:hint="default"/>
+        <w:sz w:val="20"/>
+      </w:rPr>
+    </w:lvl>
+    <w:lvl w:ilvl="7" w:tentative="1">
+      <w:start w:val="1"/>
+      <w:numFmt w:val="bullet"/>
+      <w:lvlText w:val=""/>
+      <w:lvlJc w:val="left"/>
+      <w:pPr>
+        <w:tabs>
+          <w:tab w:val="num" w:pos="5760"/>
+        </w:tabs>
+        <w:ind w:left="5760" w:hanging="360"/>
+      </w:pPr>
+      <w:rPr>
+        <w:rFonts w:ascii="Wingdings" w:hAnsi="Wingdings" w:hint="default"/>
+        <w:sz w:val="20"/>
+      </w:rPr>
+    </w:lvl>
+    <w:lvl w:ilvl="8" w:tentative="1">
+      <w:start w:val="1"/>
+      <w:numFmt w:val="bullet"/>
+      <w:lvlText w:val=""/>
+      <w:lvlJc w:val="left"/>
+      <w:pPr>
+        <w:tabs>
+          <w:tab w:val="num" w:pos="6480"/>
+        </w:tabs>
+        <w:ind w:left="6480" w:hanging="360"/>
+      </w:pPr>
+      <w:rPr>
+        <w:rFonts w:ascii="Wingdings" w:hAnsi="Wingdings" w:hint="default"/>
+        <w:sz w:val="20"/>
+      </w:rPr>
+    </w:lvl>
+  </w:abstractNum>
+  <w:abstractNum w:abstractNumId="2" w15:restartNumberingAfterBreak="0">
+    <w:nsid w:val="3A3C58EC"/>
+    <w:multiLevelType w:val="multilevel"/>
+    <w:tmpl w:val="5694DAB4"/>
+    <w:lvl w:ilvl="0">
+      <w:start w:val="1"/>
+      <w:numFmt w:val="bullet"/>
+      <w:lvlText w:val=""/>
+      <w:lvlJc w:val="left"/>
+      <w:pPr>
+        <w:tabs>
+          <w:tab w:val="num" w:pos="720"/>
+        </w:tabs>
+        <w:ind w:left="720" w:hanging="360"/>
+      </w:pPr>
+      <w:rPr>
+        <w:rFonts w:ascii="Symbol" w:hAnsi="Symbol" w:hint="default"/>
+        <w:sz w:val="20"/>
+      </w:rPr>
+    </w:lvl>
+    <w:lvl w:ilvl="1" w:tentative="1">
+      <w:start w:val="1"/>
+      <w:numFmt w:val="bullet"/>
+      <w:lvlText w:val="o"/>
+      <w:lvlJc w:val="left"/>
+      <w:pPr>
+        <w:tabs>
+          <w:tab w:val="num" w:pos="1440"/>
+        </w:tabs>
+        <w:ind w:left="1440" w:hanging="360"/>
+      </w:pPr>
+      <w:rPr>
+        <w:rFonts w:ascii="Courier New" w:hAnsi="Courier New" w:hint="default"/>
+        <w:sz w:val="20"/>
+      </w:rPr>
+    </w:lvl>
+    <w:lvl w:ilvl="2" w:tentative="1">
+      <w:start w:val="1"/>
+      <w:numFmt w:val="bullet"/>
+      <w:lvlText w:val=""/>
+      <w:lvlJc w:val="left"/>
+      <w:pPr>
+        <w:tabs>
+          <w:tab w:val="num" w:pos="2160"/>
+        </w:tabs>
+        <w:ind w:left="2160" w:hanging="360"/>
+      </w:pPr>
+      <w:rPr>
+        <w:rFonts w:ascii="Wingdings" w:hAnsi="Wingdings" w:hint="default"/>
+        <w:sz w:val="20"/>
+      </w:rPr>
+    </w:lvl>
+    <w:lvl w:ilvl="3" w:tentative="1">
+      <w:start w:val="1"/>
+      <w:numFmt w:val="bullet"/>
+      <w:lvlText w:val=""/>
+      <w:lvlJc w:val="left"/>
+      <w:pPr>
+        <w:tabs>
+          <w:tab w:val="num" w:pos="2880"/>
+        </w:tabs>
+        <w:ind w:left="2880" w:hanging="360"/>
+      </w:pPr>
+      <w:rPr>
+        <w:rFonts w:ascii="Wingdings" w:hAnsi="Wingdings" w:hint="default"/>
+        <w:sz w:val="20"/>
+      </w:rPr>
+    </w:lvl>
+    <w:lvl w:ilvl="4" w:tentative="1">
+      <w:start w:val="1"/>
+      <w:numFmt w:val="bullet"/>
+      <w:lvlText w:val=""/>
+      <w:lvlJc w:val="left"/>
+      <w:pPr>
+        <w:tabs>
+          <w:tab w:val="num" w:pos="3600"/>
+        </w:tabs>
+        <w:ind w:left="3600" w:hanging="360"/>
+      </w:pPr>
+      <w:rPr>
+        <w:rFonts w:ascii="Wingdings" w:hAnsi="Wingdings" w:hint="default"/>
+        <w:sz w:val="20"/>
+      </w:rPr>
+    </w:lvl>
+    <w:lvl w:ilvl="5" w:tentative="1">
+      <w:start w:val="1"/>
+      <w:numFmt w:val="bullet"/>
+      <w:lvlText w:val=""/>
+      <w:lvlJc w:val="left"/>
+      <w:pPr>
+        <w:tabs>
+          <w:tab w:val="num" w:pos="4320"/>
+        </w:tabs>
+        <w:ind w:left="4320" w:hanging="360"/>
+      </w:pPr>
+      <w:rPr>
+        <w:rFonts w:ascii="Wingdings" w:hAnsi="Wingdings" w:hint="default"/>
+        <w:sz w:val="20"/>
+      </w:rPr>
+    </w:lvl>
+    <w:lvl w:ilvl="6" w:tentative="1">
+      <w:start w:val="1"/>
+      <w:numFmt w:val="bullet"/>
+      <w:lvlText w:val=""/>
+      <w:lvlJc w:val="left"/>
+      <w:pPr>
+        <w:tabs>
+          <w:tab w:val="num" w:pos="5040"/>
+        </w:tabs>
+        <w:ind w:left="5040" w:hanging="360"/>
+      </w:pPr>
+      <w:rPr>
+        <w:rFonts w:ascii="Wingdings" w:hAnsi="Wingdings" w:hint="default"/>
+        <w:sz w:val="20"/>
+      </w:rPr>
+    </w:lvl>
+    <w:lvl w:ilvl="7" w:tentative="1">
+      <w:start w:val="1"/>
+      <w:numFmt w:val="bullet"/>
+      <w:lvlText w:val=""/>
+      <w:lvlJc w:val="left"/>
+      <w:pPr>
+        <w:tabs>
+          <w:tab w:val="num" w:pos="5760"/>
+        </w:tabs>
+        <w:ind w:left="5760" w:hanging="360"/>
+      </w:pPr>
+      <w:rPr>
+        <w:rFonts w:ascii="Wingdings" w:hAnsi="Wingdings" w:hint="default"/>
+        <w:sz w:val="20"/>
+      </w:rPr>
+    </w:lvl>
+    <w:lvl w:ilvl="8" w:tentative="1">
+      <w:start w:val="1"/>
+      <w:numFmt w:val="bullet"/>
+      <w:lvlText w:val=""/>
+      <w:lvlJc w:val="left"/>
+      <w:pPr>
+        <w:tabs>
+          <w:tab w:val="num" w:pos="6480"/>
+        </w:tabs>
+        <w:ind w:left="6480" w:hanging="360"/>
+      </w:pPr>
+      <w:rPr>
+        <w:rFonts w:ascii="Wingdings" w:hAnsi="Wingdings" w:hint="default"/>
+        <w:sz w:val="20"/>
+      </w:rPr>
+    </w:lvl>
+  </w:abstractNum>
+  <w:abstractNum w:abstractNumId="3" w15:restartNumberingAfterBreak="0">
+    <w:nsid w:val="401F24F5"/>
+    <w:multiLevelType w:val="multilevel"/>
+    <w:tmpl w:val="2E3C3430"/>
+    <w:lvl w:ilvl="0">
+      <w:start w:val="1"/>
+      <w:numFmt w:val="bullet"/>
+      <w:lvlText w:val=""/>
+      <w:lvlJc w:val="left"/>
+      <w:pPr>
+        <w:tabs>
+          <w:tab w:val="num" w:pos="720"/>
+        </w:tabs>
+        <w:ind w:left="720" w:hanging="360"/>
+      </w:pPr>
+      <w:rPr>
+        <w:rFonts w:ascii="Symbol" w:hAnsi="Symbol" w:hint="default"/>
+        <w:sz w:val="20"/>
+      </w:rPr>
+    </w:lvl>
+    <w:lvl w:ilvl="1" w:tentative="1">
+      <w:start w:val="1"/>
+      <w:numFmt w:val="bullet"/>
+      <w:lvlText w:val="o"/>
+      <w:lvlJc w:val="left"/>
+      <w:pPr>
+        <w:tabs>
+          <w:tab w:val="num" w:pos="1440"/>
+        </w:tabs>
+        <w:ind w:left="1440" w:hanging="360"/>
+      </w:pPr>
+      <w:rPr>
+        <w:rFonts w:ascii="Courier New" w:hAnsi="Courier New" w:hint="default"/>
+        <w:sz w:val="20"/>
+      </w:rPr>
+    </w:lvl>
+    <w:lvl w:ilvl="2" w:tentative="1">
+      <w:start w:val="1"/>
+      <w:numFmt w:val="bullet"/>
+      <w:lvlText w:val=""/>
+      <w:lvlJc w:val="left"/>
+      <w:pPr>
+        <w:tabs>
+          <w:tab w:val="num" w:pos="2160"/>
+        </w:tabs>
+        <w:ind w:left="2160" w:hanging="360"/>
+      </w:pPr>
+      <w:rPr>
+        <w:rFonts w:ascii="Wingdings" w:hAnsi="Wingdings" w:hint="default"/>
+        <w:sz w:val="20"/>
+      </w:rPr>
+    </w:lvl>
+    <w:lvl w:ilvl="3" w:tentative="1">
+      <w:start w:val="1"/>
+      <w:numFmt w:val="bullet"/>
+      <w:lvlText w:val=""/>
+      <w:lvlJc w:val="left"/>
+      <w:pPr>
+        <w:tabs>
+          <w:tab w:val="num" w:pos="2880"/>
+        </w:tabs>
+        <w:ind w:left="2880" w:hanging="360"/>
+      </w:pPr>
+      <w:rPr>
+        <w:rFonts w:ascii="Wingdings" w:hAnsi="Wingdings" w:hint="default"/>
+        <w:sz w:val="20"/>
+      </w:rPr>
+    </w:lvl>
+    <w:lvl w:ilvl="4" w:tentative="1">
+      <w:start w:val="1"/>
+      <w:numFmt w:val="bullet"/>
+      <w:lvlText w:val=""/>
+      <w:lvlJc w:val="left"/>
+      <w:pPr>
+        <w:tabs>
+          <w:tab w:val="num" w:pos="3600"/>
+        </w:tabs>
+        <w:ind w:left="3600" w:hanging="360"/>
+      </w:pPr>
+      <w:rPr>
+        <w:rFonts w:ascii="Wingdings" w:hAnsi="Wingdings" w:hint="default"/>
+        <w:sz w:val="20"/>
+      </w:rPr>
+    </w:lvl>
+    <w:lvl w:ilvl="5" w:tentative="1">
+      <w:start w:val="1"/>
+      <w:numFmt w:val="bullet"/>
+      <w:lvlText w:val=""/>
+      <w:lvlJc w:val="left"/>
+      <w:pPr>
+        <w:tabs>
+          <w:tab w:val="num" w:pos="4320"/>
+        </w:tabs>
+        <w:ind w:left="4320" w:hanging="360"/>
+      </w:pPr>
+      <w:rPr>
+        <w:rFonts w:ascii="Wingdings" w:hAnsi="Wingdings" w:hint="default"/>
+        <w:sz w:val="20"/>
+      </w:rPr>
+    </w:lvl>
+    <w:lvl w:ilvl="6" w:tentative="1">
+      <w:start w:val="1"/>
+      <w:numFmt w:val="bullet"/>
+      <w:lvlText w:val=""/>
+      <w:lvlJc w:val="left"/>
+      <w:pPr>
+        <w:tabs>
+          <w:tab w:val="num" w:pos="5040"/>
+        </w:tabs>
+        <w:ind w:left="5040" w:hanging="360"/>
+      </w:pPr>
+      <w:rPr>
+        <w:rFonts w:ascii="Wingdings" w:hAnsi="Wingdings" w:hint="default"/>
+        <w:sz w:val="20"/>
+      </w:rPr>
+    </w:lvl>
+    <w:lvl w:ilvl="7" w:tentative="1">
+      <w:start w:val="1"/>
+      <w:numFmt w:val="bullet"/>
+      <w:lvlText w:val=""/>
+      <w:lvlJc w:val="left"/>
+      <w:pPr>
+        <w:tabs>
+          <w:tab w:val="num" w:pos="5760"/>
+        </w:tabs>
+        <w:ind w:left="5760" w:hanging="360"/>
+      </w:pPr>
+      <w:rPr>
+        <w:rFonts w:ascii="Wingdings" w:hAnsi="Wingdings" w:hint="default"/>
+        <w:sz w:val="20"/>
+      </w:rPr>
+    </w:lvl>
+    <w:lvl w:ilvl="8" w:tentative="1">
+      <w:start w:val="1"/>
+      <w:numFmt w:val="bullet"/>
+      <w:lvlText w:val=""/>
+      <w:lvlJc w:val="left"/>
+      <w:pPr>
+        <w:tabs>
+          <w:tab w:val="num" w:pos="6480"/>
+        </w:tabs>
+        <w:ind w:left="6480" w:hanging="360"/>
+      </w:pPr>
+      <w:rPr>
+        <w:rFonts w:ascii="Wingdings" w:hAnsi="Wingdings" w:hint="default"/>
+        <w:sz w:val="20"/>
+      </w:rPr>
+    </w:lvl>
+  </w:abstractNum>
+  <w:abstractNum w:abstractNumId="4" w15:restartNumberingAfterBreak="0">
+    <w:nsid w:val="5AC63438"/>
+    <w:multiLevelType w:val="multilevel"/>
+    <w:tmpl w:val="F9EC71D2"/>
+    <w:lvl w:ilvl="0">
+      <w:start w:val="1"/>
+      <w:numFmt w:val="bullet"/>
+      <w:lvlText w:val=""/>
+      <w:lvlJc w:val="left"/>
+      <w:pPr>
+        <w:tabs>
+          <w:tab w:val="num" w:pos="720"/>
+        </w:tabs>
+        <w:ind w:left="720" w:hanging="360"/>
+      </w:pPr>
+      <w:rPr>
+        <w:rFonts w:ascii="Symbol" w:hAnsi="Symbol" w:hint="default"/>
+        <w:sz w:val="20"/>
+      </w:rPr>
+    </w:lvl>
+    <w:lvl w:ilvl="1" w:tentative="1">
+      <w:start w:val="1"/>
+      <w:numFmt w:val="bullet"/>
+      <w:lvlText w:val="o"/>
+      <w:lvlJc w:val="left"/>
+      <w:pPr>
+        <w:tabs>
+          <w:tab w:val="num" w:pos="1440"/>
+        </w:tabs>
+        <w:ind w:left="1440" w:hanging="360"/>
+      </w:pPr>
+      <w:rPr>
+        <w:rFonts w:ascii="Courier New" w:hAnsi="Courier New" w:hint="default"/>
+        <w:sz w:val="20"/>
+      </w:rPr>
+    </w:lvl>
+    <w:lvl w:ilvl="2" w:tentative="1">
+      <w:start w:val="1"/>
+      <w:numFmt w:val="bullet"/>
+      <w:lvlText w:val=""/>
+      <w:lvlJc w:val="left"/>
+      <w:pPr>
+        <w:tabs>
+          <w:tab w:val="num" w:pos="2160"/>
+        </w:tabs>
+        <w:ind w:left="2160" w:hanging="360"/>
+      </w:pPr>
+      <w:rPr>
+        <w:rFonts w:ascii="Wingdings" w:hAnsi="Wingdings" w:hint="default"/>
+        <w:sz w:val="20"/>
+      </w:rPr>
+    </w:lvl>
+    <w:lvl w:ilvl="3" w:tentative="1">
+      <w:start w:val="1"/>
+      <w:numFmt w:val="bullet"/>
+      <w:lvlText w:val=""/>
+      <w:lvlJc w:val="left"/>
+      <w:pPr>
+        <w:tabs>
+          <w:tab w:val="num" w:pos="2880"/>
+        </w:tabs>
+        <w:ind w:left="2880" w:hanging="360"/>
+      </w:pPr>
+      <w:rPr>
+        <w:rFonts w:ascii="Wingdings" w:hAnsi="Wingdings" w:hint="default"/>
+        <w:sz w:val="20"/>
+      </w:rPr>
+    </w:lvl>
+    <w:lvl w:ilvl="4" w:tentative="1">
+      <w:start w:val="1"/>
+      <w:numFmt w:val="bullet"/>
+      <w:lvlText w:val=""/>
+      <w:lvlJc w:val="left"/>
+      <w:pPr>
+        <w:tabs>
+          <w:tab w:val="num" w:pos="3600"/>
+        </w:tabs>
+        <w:ind w:left="3600" w:hanging="360"/>
+      </w:pPr>
+      <w:rPr>
+        <w:rFonts w:ascii="Wingdings" w:hAnsi="Wingdings" w:hint="default"/>
+        <w:sz w:val="20"/>
+      </w:rPr>
+    </w:lvl>
+    <w:lvl w:ilvl="5" w:tentative="1">
+      <w:start w:val="1"/>
+      <w:numFmt w:val="bullet"/>
+      <w:lvlText w:val=""/>
+      <w:lvlJc w:val="left"/>
+      <w:pPr>
+        <w:tabs>
+          <w:tab w:val="num" w:pos="4320"/>
+        </w:tabs>
+        <w:ind w:left="4320" w:hanging="360"/>
+      </w:pPr>
+      <w:rPr>
+        <w:rFonts w:ascii="Wingdings" w:hAnsi="Wingdings" w:hint="default"/>
+        <w:sz w:val="20"/>
+      </w:rPr>
+    </w:lvl>
+    <w:lvl w:ilvl="6" w:tentative="1">
+      <w:start w:val="1"/>
+      <w:numFmt w:val="bullet"/>
+      <w:lvlText w:val=""/>
+      <w:lvlJc w:val="left"/>
+      <w:pPr>
+        <w:tabs>
+          <w:tab w:val="num" w:pos="5040"/>
+        </w:tabs>
+        <w:ind w:left="5040" w:hanging="360"/>
+      </w:pPr>
+      <w:rPr>
+        <w:rFonts w:ascii="Wingdings" w:hAnsi="Wingdings" w:hint="default"/>
+        <w:sz w:val="20"/>
+      </w:rPr>
+    </w:lvl>
+    <w:lvl w:ilvl="7" w:tentative="1">
+      <w:start w:val="1"/>
+      <w:numFmt w:val="bullet"/>
+      <w:lvlText w:val=""/>
+      <w:lvlJc w:val="left"/>
+      <w:pPr>
+        <w:tabs>
+          <w:tab w:val="num" w:pos="5760"/>
+        </w:tabs>
+        <w:ind w:left="5760" w:hanging="360"/>
+      </w:pPr>
+      <w:rPr>
+        <w:rFonts w:ascii="Wingdings" w:hAnsi="Wingdings" w:hint="default"/>
+        <w:sz w:val="20"/>
+      </w:rPr>
+    </w:lvl>
+    <w:lvl w:ilvl="8" w:tentative="1">
+      <w:start w:val="1"/>
+      <w:numFmt w:val="bullet"/>
+      <w:lvlText w:val=""/>
+      <w:lvlJc w:val="left"/>
+      <w:pPr>
+        <w:tabs>
+          <w:tab w:val="num" w:pos="6480"/>
+        </w:tabs>
+        <w:ind w:left="6480" w:hanging="360"/>
+      </w:pPr>
+      <w:rPr>
+        <w:rFonts w:ascii="Wingdings" w:hAnsi="Wingdings" w:hint="default"/>
+        <w:sz w:val="20"/>
+      </w:rPr>
+    </w:lvl>
+  </w:abstractNum>
+  <w:abstractNum w:abstractNumId="5" w15:restartNumberingAfterBreak="0">
+    <w:nsid w:val="5FA8686F"/>
+    <w:multiLevelType w:val="multilevel"/>
+    <w:tmpl w:val="5E0C90CE"/>
+    <w:lvl w:ilvl="0">
+      <w:start w:val="1"/>
+      <w:numFmt w:val="bullet"/>
+      <w:lvlText w:val=""/>
+      <w:lvlJc w:val="left"/>
+      <w:pPr>
+        <w:tabs>
+          <w:tab w:val="num" w:pos="720"/>
+        </w:tabs>
+        <w:ind w:left="720" w:hanging="360"/>
+      </w:pPr>
+      <w:rPr>
+        <w:rFonts w:ascii="Symbol" w:hAnsi="Symbol" w:hint="default"/>
+        <w:sz w:val="20"/>
+      </w:rPr>
+    </w:lvl>
+    <w:lvl w:ilvl="1" w:tentative="1">
+      <w:start w:val="1"/>
+      <w:numFmt w:val="bullet"/>
+      <w:lvlText w:val="o"/>
+      <w:lvlJc w:val="left"/>
+      <w:pPr>
+        <w:tabs>
+          <w:tab w:val="num" w:pos="1440"/>
+        </w:tabs>
+        <w:ind w:left="1440" w:hanging="360"/>
+      </w:pPr>
+      <w:rPr>
+        <w:rFonts w:ascii="Courier New" w:hAnsi="Courier New" w:hint="default"/>
+        <w:sz w:val="20"/>
+      </w:rPr>
+    </w:lvl>
+    <w:lvl w:ilvl="2" w:tentative="1">
+      <w:start w:val="1"/>
+      <w:numFmt w:val="bullet"/>
+      <w:lvlText w:val=""/>
+      <w:lvlJc w:val="left"/>
+      <w:pPr>
+        <w:tabs>
+          <w:tab w:val="num" w:pos="2160"/>
+        </w:tabs>
+        <w:ind w:left="2160" w:hanging="360"/>
+      </w:pPr>
+      <w:rPr>
+        <w:rFonts w:ascii="Wingdings" w:hAnsi="Wingdings" w:hint="default"/>
+        <w:sz w:val="20"/>
+      </w:rPr>
+    </w:lvl>
+    <w:lvl w:ilvl="3" w:tentative="1">
+      <w:start w:val="1"/>
+      <w:numFmt w:val="bullet"/>
+      <w:lvlText w:val=""/>
+      <w:lvlJc w:val="left"/>
+      <w:pPr>
+        <w:tabs>
+          <w:tab w:val="num" w:pos="2880"/>
+        </w:tabs>
+        <w:ind w:left="2880" w:hanging="360"/>
+      </w:pPr>
+      <w:rPr>
+        <w:rFonts w:ascii="Wingdings" w:hAnsi="Wingdings" w:hint="default"/>
+        <w:sz w:val="20"/>
+      </w:rPr>
+    </w:lvl>
+    <w:lvl w:ilvl="4" w:tentative="1">
+      <w:start w:val="1"/>
+      <w:numFmt w:val="bullet"/>
+      <w:lvlText w:val=""/>
+      <w:lvlJc w:val="left"/>
+      <w:pPr>
+        <w:tabs>
+          <w:tab w:val="num" w:pos="3600"/>
+        </w:tabs>
+        <w:ind w:left="3600" w:hanging="360"/>
+      </w:pPr>
+      <w:rPr>
+        <w:rFonts w:ascii="Wingdings" w:hAnsi="Wingdings" w:hint="default"/>
+        <w:sz w:val="20"/>
+      </w:rPr>
+    </w:lvl>
+    <w:lvl w:ilvl="5" w:tentative="1">
+      <w:start w:val="1"/>
+      <w:numFmt w:val="bullet"/>
+      <w:lvlText w:val=""/>
+      <w:lvlJc w:val="left"/>
+      <w:pPr>
+        <w:tabs>
+          <w:tab w:val="num" w:pos="4320"/>
+        </w:tabs>
+        <w:ind w:left="4320" w:hanging="360"/>
+      </w:pPr>
+      <w:rPr>
+        <w:rFonts w:ascii="Wingdings" w:hAnsi="Wingdings" w:hint="default"/>
+        <w:sz w:val="20"/>
+      </w:rPr>
+    </w:lvl>
+    <w:lvl w:ilvl="6" w:tentative="1">
+      <w:start w:val="1"/>
+      <w:numFmt w:val="bullet"/>
+      <w:lvlText w:val=""/>
+      <w:lvlJc w:val="left"/>
+      <w:pPr>
+        <w:tabs>
+          <w:tab w:val="num" w:pos="5040"/>
+        </w:tabs>
+        <w:ind w:left="5040" w:hanging="360"/>
+      </w:pPr>
+      <w:rPr>
+        <w:rFonts w:ascii="Wingdings" w:hAnsi="Wingdings" w:hint="default"/>
+        <w:sz w:val="20"/>
+      </w:rPr>
+    </w:lvl>
+    <w:lvl w:ilvl="7" w:tentative="1">
+      <w:start w:val="1"/>
+      <w:numFmt w:val="bullet"/>
+      <w:lvlText w:val=""/>
+      <w:lvlJc w:val="left"/>
+      <w:pPr>
+        <w:tabs>
+          <w:tab w:val="num" w:pos="5760"/>
+        </w:tabs>
+        <w:ind w:left="5760" w:hanging="360"/>
+      </w:pPr>
+      <w:rPr>
+        <w:rFonts w:ascii="Wingdings" w:hAnsi="Wingdings" w:hint="default"/>
+        <w:sz w:val="20"/>
+      </w:rPr>
+    </w:lvl>
+    <w:lvl w:ilvl="8" w:tentative="1">
+      <w:start w:val="1"/>
+      <w:numFmt w:val="bullet"/>
+      <w:lvlText w:val=""/>
+      <w:lvlJc w:val="left"/>
+      <w:pPr>
+        <w:tabs>
+          <w:tab w:val="num" w:pos="6480"/>
+        </w:tabs>
+        <w:ind w:left="6480" w:hanging="360"/>
+      </w:pPr>
+      <w:rPr>
+        <w:rFonts w:ascii="Wingdings" w:hAnsi="Wingdings" w:hint="default"/>
+        <w:sz w:val="20"/>
+      </w:rPr>
+    </w:lvl>
+  </w:abstractNum>
+  <w:abstractNum w:abstractNumId="6" w15:restartNumberingAfterBreak="0">
+    <w:nsid w:val="723C3220"/>
+    <w:multiLevelType w:val="multilevel"/>
+    <w:tmpl w:val="8C123708"/>
+    <w:lvl w:ilvl="0">
+      <w:start w:val="1"/>
+      <w:numFmt w:val="bullet"/>
+      <w:lvlText w:val=""/>
+      <w:lvlJc w:val="left"/>
+      <w:pPr>
+        <w:tabs>
+          <w:tab w:val="num" w:pos="720"/>
+        </w:tabs>
+        <w:ind w:left="720" w:hanging="360"/>
+      </w:pPr>
+      <w:rPr>
+        <w:rFonts w:ascii="Symbol" w:hAnsi="Symbol" w:hint="default"/>
+        <w:sz w:val="20"/>
+      </w:rPr>
+    </w:lvl>
+    <w:lvl w:ilvl="1" w:tentative="1">
+      <w:start w:val="1"/>
+      <w:numFmt w:val="bullet"/>
+      <w:lvlText w:val="o"/>
+      <w:lvlJc w:val="left"/>
+      <w:pPr>
+        <w:tabs>
+          <w:tab w:val="num" w:pos="1440"/>
+        </w:tabs>
+        <w:ind w:left="1440" w:hanging="360"/>
+      </w:pPr>
+      <w:rPr>
+        <w:rFonts w:ascii="Courier New" w:hAnsi="Courier New" w:hint="default"/>
+        <w:sz w:val="20"/>
+      </w:rPr>
+    </w:lvl>
+    <w:lvl w:ilvl="2" w:tentative="1">
+      <w:start w:val="1"/>
+      <w:numFmt w:val="bullet"/>
+      <w:lvlText w:val=""/>
+      <w:lvlJc w:val="left"/>
+      <w:pPr>
+        <w:tabs>
+          <w:tab w:val="num" w:pos="2160"/>
+        </w:tabs>
+        <w:ind w:left="2160" w:hanging="360"/>
+      </w:pPr>
+      <w:rPr>
+        <w:rFonts w:ascii="Wingdings" w:hAnsi="Wingdings" w:hint="default"/>
+        <w:sz w:val="20"/>
+      </w:rPr>
+    </w:lvl>
+    <w:lvl w:ilvl="3" w:tentative="1">
+      <w:start w:val="1"/>
+      <w:numFmt w:val="bullet"/>
+      <w:lvlText w:val=""/>
+      <w:lvlJc w:val="left"/>
+      <w:pPr>
+        <w:tabs>
+          <w:tab w:val="num" w:pos="2880"/>
+        </w:tabs>
+        <w:ind w:left="2880" w:hanging="360"/>
+      </w:pPr>
+      <w:rPr>
+        <w:rFonts w:ascii="Wingdings" w:hAnsi="Wingdings" w:hint="default"/>
+        <w:sz w:val="20"/>
+      </w:rPr>
+    </w:lvl>
+    <w:lvl w:ilvl="4" w:tentative="1">
+      <w:start w:val="1"/>
+      <w:numFmt w:val="bullet"/>
+      <w:lvlText w:val=""/>
+      <w:lvlJc w:val="left"/>
+      <w:pPr>
+        <w:tabs>
+          <w:tab w:val="num" w:pos="3600"/>
+        </w:tabs>
+        <w:ind w:left="3600" w:hanging="360"/>
+      </w:pPr>
+      <w:rPr>
+        <w:rFonts w:ascii="Wingdings" w:hAnsi="Wingdings" w:hint="default"/>
+        <w:sz w:val="20"/>
+      </w:rPr>
+    </w:lvl>
+    <w:lvl w:ilvl="5" w:tentative="1">
+      <w:start w:val="1"/>
+      <w:numFmt w:val="bullet"/>
+      <w:lvlText w:val=""/>
+      <w:lvlJc w:val="left"/>
+      <w:pPr>
+        <w:tabs>
+          <w:tab w:val="num" w:pos="4320"/>
+        </w:tabs>
+        <w:ind w:left="4320" w:hanging="360"/>
+      </w:pPr>
+      <w:rPr>
+        <w:rFonts w:ascii="Wingdings" w:hAnsi="Wingdings" w:hint="default"/>
+        <w:sz w:val="20"/>
+      </w:rPr>
+    </w:lvl>
+    <w:lvl w:ilvl="6" w:tentative="1">
+      <w:start w:val="1"/>
+      <w:numFmt w:val="bullet"/>
+      <w:lvlText w:val=""/>
+      <w:lvlJc w:val="left"/>
+      <w:pPr>
+        <w:tabs>
+          <w:tab w:val="num" w:pos="5040"/>
+        </w:tabs>
+        <w:ind w:left="5040" w:hanging="360"/>
+      </w:pPr>
+      <w:rPr>
+        <w:rFonts w:ascii="Wingdings" w:hAnsi="Wingdings" w:hint="default"/>
+        <w:sz w:val="20"/>
+      </w:rPr>
+    </w:lvl>
+    <w:lvl w:ilvl="7" w:tentative="1">
+      <w:start w:val="1"/>
+      <w:numFmt w:val="bullet"/>
+      <w:lvlText w:val=""/>
+      <w:lvlJc w:val="left"/>
+      <w:pPr>
+        <w:tabs>
+          <w:tab w:val="num" w:pos="5760"/>
+        </w:tabs>
+        <w:ind w:left="5760" w:hanging="360"/>
+      </w:pPr>
+      <w:rPr>
+        <w:rFonts w:ascii="Wingdings" w:hAnsi="Wingdings" w:hint="default"/>
+        <w:sz w:val="20"/>
+      </w:rPr>
+    </w:lvl>
+    <w:lvl w:ilvl="8" w:tentative="1">
+      <w:start w:val="1"/>
+      <w:numFmt w:val="bullet"/>
+      <w:lvlText w:val=""/>
+      <w:lvlJc w:val="left"/>
+      <w:pPr>
+        <w:tabs>
+          <w:tab w:val="num" w:pos="6480"/>
+        </w:tabs>
+        <w:ind w:left="6480" w:hanging="360"/>
+      </w:pPr>
+      <w:rPr>
+        <w:rFonts w:ascii="Wingdings" w:hAnsi="Wingdings" w:hint="default"/>
+        <w:sz w:val="20"/>
+      </w:rPr>
+    </w:lvl>
+  </w:abstractNum>
+  <w:abstractNum w:abstractNumId="7" w15:restartNumberingAfterBreak="0">
+    <w:nsid w:val="75EC2D26"/>
+    <w:multiLevelType w:val="multilevel"/>
+    <w:tmpl w:val="7B5A9F72"/>
+    <w:lvl w:ilvl="0">
+      <w:start w:val="1"/>
+      <w:numFmt w:val="bullet"/>
+      <w:lvlText w:val=""/>
+      <w:lvlJc w:val="left"/>
+      <w:pPr>
+        <w:tabs>
+          <w:tab w:val="num" w:pos="720"/>
+        </w:tabs>
+        <w:ind w:left="720" w:hanging="360"/>
+      </w:pPr>
+      <w:rPr>
+        <w:rFonts w:ascii="Symbol" w:hAnsi="Symbol" w:hint="default"/>
+        <w:sz w:val="20"/>
+      </w:rPr>
+    </w:lvl>
+    <w:lvl w:ilvl="1" w:tentative="1">
+      <w:start w:val="1"/>
+      <w:numFmt w:val="bullet"/>
+      <w:lvlText w:val="o"/>
+      <w:lvlJc w:val="left"/>
+      <w:pPr>
+        <w:tabs>
+          <w:tab w:val="num" w:pos="1440"/>
+        </w:tabs>
+        <w:ind w:left="1440" w:hanging="360"/>
+      </w:pPr>
+      <w:rPr>
+        <w:rFonts w:ascii="Courier New" w:hAnsi="Courier New" w:hint="default"/>
+        <w:sz w:val="20"/>
+      </w:rPr>
+    </w:lvl>
+    <w:lvl w:ilvl="2" w:tentative="1">
+      <w:start w:val="1"/>
+      <w:numFmt w:val="bullet"/>
+      <w:lvlText w:val=""/>
+      <w:lvlJc w:val="left"/>
+      <w:pPr>
+        <w:tabs>
+          <w:tab w:val="num" w:pos="2160"/>
+        </w:tabs>
+        <w:ind w:left="2160" w:hanging="360"/>
+      </w:pPr>
+      <w:rPr>
+        <w:rFonts w:ascii="Wingdings" w:hAnsi="Wingdings" w:hint="default"/>
+        <w:sz w:val="20"/>
+      </w:rPr>
+    </w:lvl>
+    <w:lvl w:ilvl="3" w:tentative="1">
+      <w:start w:val="1"/>
+      <w:numFmt w:val="bullet"/>
+      <w:lvlText w:val=""/>
+      <w:lvlJc w:val="left"/>
+      <w:pPr>
+        <w:tabs>
+          <w:tab w:val="num" w:pos="2880"/>
+        </w:tabs>
+        <w:ind w:left="2880" w:hanging="360"/>
+      </w:pPr>
+      <w:rPr>
+        <w:rFonts w:ascii="Wingdings" w:hAnsi="Wingdings" w:hint="default"/>
+        <w:sz w:val="20"/>
+      </w:rPr>
+    </w:lvl>
+    <w:lvl w:ilvl="4" w:tentative="1">
+      <w:start w:val="1"/>
+      <w:numFmt w:val="bullet"/>
+      <w:lvlText w:val=""/>
+      <w:lvlJc w:val="left"/>
+      <w:pPr>
+        <w:tabs>
+          <w:tab w:val="num" w:pos="3600"/>
+        </w:tabs>
+        <w:ind w:left="3600" w:hanging="360"/>
+      </w:pPr>
+      <w:rPr>
+        <w:rFonts w:ascii="Wingdings" w:hAnsi="Wingdings" w:hint="default"/>
+        <w:sz w:val="20"/>
+      </w:rPr>
+    </w:lvl>
+    <w:lvl w:ilvl="5" w:tentative="1">
+      <w:start w:val="1"/>
+      <w:numFmt w:val="bullet"/>
+      <w:lvlText w:val=""/>
+      <w:lvlJc w:val="left"/>
+      <w:pPr>
+        <w:tabs>
+          <w:tab w:val="num" w:pos="4320"/>
+        </w:tabs>
+        <w:ind w:left="4320" w:hanging="360"/>
+      </w:pPr>
+      <w:rPr>
+        <w:rFonts w:ascii="Wingdings" w:hAnsi="Wingdings" w:hint="default"/>
+        <w:sz w:val="20"/>
+      </w:rPr>
+    </w:lvl>
+    <w:lvl w:ilvl="6" w:tentative="1">
+      <w:start w:val="1"/>
+      <w:numFmt w:val="bullet"/>
+      <w:lvlText w:val=""/>
+      <w:lvlJc w:val="left"/>
+      <w:pPr>
+        <w:tabs>
+          <w:tab w:val="num" w:pos="5040"/>
+        </w:tabs>
+        <w:ind w:left="5040" w:hanging="360"/>
+      </w:pPr>
+      <w:rPr>
+        <w:rFonts w:ascii="Wingdings" w:hAnsi="Wingdings" w:hint="default"/>
+        <w:sz w:val="20"/>
+      </w:rPr>
+    </w:lvl>
+    <w:lvl w:ilvl="7" w:tentative="1">
+      <w:start w:val="1"/>
+      <w:numFmt w:val="bullet"/>
+      <w:lvlText w:val=""/>
+      <w:lvlJc w:val="left"/>
+      <w:pPr>
+        <w:tabs>
+          <w:tab w:val="num" w:pos="5760"/>
+        </w:tabs>
+        <w:ind w:left="5760" w:hanging="360"/>
+      </w:pPr>
+      <w:rPr>
+        <w:rFonts w:ascii="Wingdings" w:hAnsi="Wingdings" w:hint="default"/>
+        <w:sz w:val="20"/>
+      </w:rPr>
+    </w:lvl>
+    <w:lvl w:ilvl="8" w:tentative="1">
+      <w:start w:val="1"/>
+      <w:numFmt w:val="bullet"/>
+      <w:lvlText w:val=""/>
+      <w:lvlJc w:val="left"/>
+      <w:pPr>
+        <w:tabs>
+          <w:tab w:val="num" w:pos="6480"/>
+        </w:tabs>
+        <w:ind w:left="6480" w:hanging="360"/>
+      </w:pPr>
+      <w:rPr>
+        <w:rFonts w:ascii="Wingdings" w:hAnsi="Wingdings" w:hint="default"/>
+        <w:sz w:val="20"/>
+      </w:rPr>
+    </w:lvl>
+  </w:abstractNum>
+  <w:abstractNum w:abstractNumId="8" w15:restartNumberingAfterBreak="0">
+    <w:nsid w:val="767940B9"/>
+    <w:multiLevelType w:val="multilevel"/>
+    <w:tmpl w:val="8EEC55EC"/>
+    <w:lvl w:ilvl="0">
+      <w:start w:val="1"/>
+      <w:numFmt w:val="bullet"/>
+      <w:lvlText w:val=""/>
+      <w:lvlJc w:val="left"/>
+      <w:pPr>
+        <w:tabs>
+          <w:tab w:val="num" w:pos="720"/>
+        </w:tabs>
+        <w:ind w:left="720" w:hanging="360"/>
+      </w:pPr>
+      <w:rPr>
+        <w:rFonts w:ascii="Symbol" w:hAnsi="Symbol" w:hint="default"/>
+        <w:sz w:val="20"/>
+      </w:rPr>
+    </w:lvl>
+    <w:lvl w:ilvl="1" w:tentative="1">
+      <w:start w:val="1"/>
+      <w:numFmt w:val="bullet"/>
+      <w:lvlText w:val="o"/>
+      <w:lvlJc w:val="left"/>
+      <w:pPr>
+        <w:tabs>
+          <w:tab w:val="num" w:pos="1440"/>
+        </w:tabs>
+        <w:ind w:left="1440" w:hanging="360"/>
+      </w:pPr>
+      <w:rPr>
+        <w:rFonts w:ascii="Courier New" w:hAnsi="Courier New" w:hint="default"/>
+        <w:sz w:val="20"/>
+      </w:rPr>
+    </w:lvl>
+    <w:lvl w:ilvl="2" w:tentative="1">
+      <w:start w:val="1"/>
+      <w:numFmt w:val="bullet"/>
+      <w:lvlText w:val=""/>
+      <w:lvlJc w:val="left"/>
+      <w:pPr>
+        <w:tabs>
+          <w:tab w:val="num" w:pos="2160"/>
+        </w:tabs>
+        <w:ind w:left="2160" w:hanging="360"/>
+      </w:pPr>
+      <w:rPr>
+        <w:rFonts w:ascii="Wingdings" w:hAnsi="Wingdings" w:hint="default"/>
+        <w:sz w:val="20"/>
+      </w:rPr>
+    </w:lvl>
+    <w:lvl w:ilvl="3" w:tentative="1">
+      <w:start w:val="1"/>
+      <w:numFmt w:val="bullet"/>
+      <w:lvlText w:val=""/>
+      <w:lvlJc w:val="left"/>
+      <w:pPr>
+        <w:tabs>
+          <w:tab w:val="num" w:pos="2880"/>
+        </w:tabs>
+        <w:ind w:left="2880" w:hanging="360"/>
+      </w:pPr>
+      <w:rPr>
+        <w:rFonts w:ascii="Wingdings" w:hAnsi="Wingdings" w:hint="default"/>
+        <w:sz w:val="20"/>
+      </w:rPr>
+    </w:lvl>
+    <w:lvl w:ilvl="4" w:tentative="1">
+      <w:start w:val="1"/>
+      <w:numFmt w:val="bullet"/>
+      <w:lvlText w:val=""/>
+      <w:lvlJc w:val="left"/>
+      <w:pPr>
+        <w:tabs>
+          <w:tab w:val="num" w:pos="3600"/>
+        </w:tabs>
+        <w:ind w:left="3600" w:hanging="360"/>
+      </w:pPr>
+      <w:rPr>
+        <w:rFonts w:ascii="Wingdings" w:hAnsi="Wingdings" w:hint="default"/>
+        <w:sz w:val="20"/>
+      </w:rPr>
+    </w:lvl>
+    <w:lvl w:ilvl="5" w:tentative="1">
+      <w:start w:val="1"/>
+      <w:numFmt w:val="bullet"/>
+      <w:lvlText w:val=""/>
+      <w:lvlJc w:val="left"/>
+      <w:pPr>
+        <w:tabs>
+          <w:tab w:val="num" w:pos="4320"/>
+        </w:tabs>
+        <w:ind w:left="4320" w:hanging="360"/>
+      </w:pPr>
+      <w:rPr>
+        <w:rFonts w:ascii="Wingdings" w:hAnsi="Wingdings" w:hint="default"/>
+        <w:sz w:val="20"/>
+      </w:rPr>
+    </w:lvl>
+    <w:lvl w:ilvl="6" w:tentative="1">
+      <w:start w:val="1"/>
+      <w:numFmt w:val="bullet"/>
+      <w:lvlText w:val=""/>
+      <w:lvlJc w:val="left"/>
+      <w:pPr>
+        <w:tabs>
+          <w:tab w:val="num" w:pos="5040"/>
+        </w:tabs>
+        <w:ind w:left="5040" w:hanging="360"/>
+      </w:pPr>
+      <w:rPr>
+        <w:rFonts w:ascii="Wingdings" w:hAnsi="Wingdings" w:hint="default"/>
+        <w:sz w:val="20"/>
+      </w:rPr>
+    </w:lvl>
+    <w:lvl w:ilvl="7" w:tentative="1">
+      <w:start w:val="1"/>
+      <w:numFmt w:val="bullet"/>
+      <w:lvlText w:val=""/>
+      <w:lvlJc w:val="left"/>
+      <w:pPr>
+        <w:tabs>
+          <w:tab w:val="num" w:pos="5760"/>
+        </w:tabs>
+        <w:ind w:left="5760" w:hanging="360"/>
+      </w:pPr>
+      <w:rPr>
+        <w:rFonts w:ascii="Wingdings" w:hAnsi="Wingdings" w:hint="default"/>
+        <w:sz w:val="20"/>
+      </w:rPr>
+    </w:lvl>
+    <w:lvl w:ilvl="8" w:tentative="1">
+      <w:start w:val="1"/>
+      <w:numFmt w:val="bullet"/>
+      <w:lvlText w:val=""/>
+      <w:lvlJc w:val="left"/>
+      <w:pPr>
+        <w:tabs>
+          <w:tab w:val="num" w:pos="6480"/>
+        </w:tabs>
+        <w:ind w:left="6480" w:hanging="360"/>
+      </w:pPr>
+      <w:rPr>
+        <w:rFonts w:ascii="Wingdings" w:hAnsi="Wingdings" w:hint="default"/>
+        <w:sz w:val="20"/>
+      </w:rPr>
+    </w:lvl>
+  </w:abstractNum>
+  <w:abstractNum w:abstractNumId="9" w15:restartNumberingAfterBreak="0">
+    <w:nsid w:val="7A6304CF"/>
+    <w:multiLevelType w:val="multilevel"/>
+    <w:tmpl w:val="2BA48D5A"/>
+    <w:lvl w:ilvl="0">
+      <w:start w:val="1"/>
+      <w:numFmt w:val="bullet"/>
+      <w:lvlText w:val=""/>
+      <w:lvlJc w:val="left"/>
+      <w:pPr>
+        <w:tabs>
+          <w:tab w:val="num" w:pos="720"/>
+        </w:tabs>
+        <w:ind w:left="720" w:hanging="360"/>
+      </w:pPr>
+      <w:rPr>
+        <w:rFonts w:ascii="Symbol" w:hAnsi="Symbol" w:hint="default"/>
+        <w:sz w:val="20"/>
+      </w:rPr>
+    </w:lvl>
+    <w:lvl w:ilvl="1" w:tentative="1">
+      <w:start w:val="1"/>
+      <w:numFmt w:val="bullet"/>
+      <w:lvlText w:val="o"/>
+      <w:lvlJc w:val="left"/>
+      <w:pPr>
+        <w:tabs>
+          <w:tab w:val="num" w:pos="1440"/>
+        </w:tabs>
+        <w:ind w:left="1440" w:hanging="360"/>
+      </w:pPr>
+      <w:rPr>
+        <w:rFonts w:ascii="Courier New" w:hAnsi="Courier New" w:hint="default"/>
+        <w:sz w:val="20"/>
+      </w:rPr>
+    </w:lvl>
+    <w:lvl w:ilvl="2" w:tentative="1">
+      <w:start w:val="1"/>
+      <w:numFmt w:val="bullet"/>
+      <w:lvlText w:val=""/>
+      <w:lvlJc w:val="left"/>
+      <w:pPr>
+        <w:tabs>
+          <w:tab w:val="num" w:pos="2160"/>
+        </w:tabs>
+        <w:ind w:left="2160" w:hanging="360"/>
+      </w:pPr>
+      <w:rPr>
+        <w:rFonts w:ascii="Wingdings" w:hAnsi="Wingdings" w:hint="default"/>
+        <w:sz w:val="20"/>
+      </w:rPr>
+    </w:lvl>
+    <w:lvl w:ilvl="3" w:tentative="1">
+      <w:start w:val="1"/>
+      <w:numFmt w:val="bullet"/>
+      <w:lvlText w:val=""/>
+      <w:lvlJc w:val="left"/>
+      <w:pPr>
+        <w:tabs>
+          <w:tab w:val="num" w:pos="2880"/>
+        </w:tabs>
+        <w:ind w:left="2880" w:hanging="360"/>
+      </w:pPr>
+      <w:rPr>
+        <w:rFonts w:ascii="Wingdings" w:hAnsi="Wingdings" w:hint="default"/>
+        <w:sz w:val="20"/>
+      </w:rPr>
+    </w:lvl>
+    <w:lvl w:ilvl="4" w:tentative="1">
+      <w:start w:val="1"/>
+      <w:numFmt w:val="bullet"/>
+      <w:lvlText w:val=""/>
+      <w:lvlJc w:val="left"/>
+      <w:pPr>
+        <w:tabs>
+          <w:tab w:val="num" w:pos="3600"/>
+        </w:tabs>
+        <w:ind w:left="3600" w:hanging="360"/>
+      </w:pPr>
+      <w:rPr>
+        <w:rFonts w:ascii="Wingdings" w:hAnsi="Wingdings" w:hint="default"/>
+        <w:sz w:val="20"/>
+      </w:rPr>
+    </w:lvl>
+    <w:lvl w:ilvl="5" w:tentative="1">
+      <w:start w:val="1"/>
+      <w:numFmt w:val="bullet"/>
+      <w:lvlText w:val=""/>
+      <w:lvlJc w:val="left"/>
+      <w:pPr>
+        <w:tabs>
+          <w:tab w:val="num" w:pos="4320"/>
+        </w:tabs>
+        <w:ind w:left="4320" w:hanging="360"/>
+      </w:pPr>
+      <w:rPr>
+        <w:rFonts w:ascii="Wingdings" w:hAnsi="Wingdings" w:hint="default"/>
+        <w:sz w:val="20"/>
+      </w:rPr>
+    </w:lvl>
+    <w:lvl w:ilvl="6" w:tentative="1">
+      <w:start w:val="1"/>
+      <w:numFmt w:val="bullet"/>
+      <w:lvlText w:val=""/>
+      <w:lvlJc w:val="left"/>
+      <w:pPr>
+        <w:tabs>
+          <w:tab w:val="num" w:pos="5040"/>
+        </w:tabs>
+        <w:ind w:left="5040" w:hanging="360"/>
+      </w:pPr>
+      <w:rPr>
+        <w:rFonts w:ascii="Wingdings" w:hAnsi="Wingdings" w:hint="default"/>
+        <w:sz w:val="20"/>
+      </w:rPr>
+    </w:lvl>
+    <w:lvl w:ilvl="7" w:tentative="1">
+      <w:start w:val="1"/>
+      <w:numFmt w:val="bullet"/>
+      <w:lvlText w:val=""/>
+      <w:lvlJc w:val="left"/>
+      <w:pPr>
+        <w:tabs>
+          <w:tab w:val="num" w:pos="5760"/>
+        </w:tabs>
+        <w:ind w:left="5760" w:hanging="360"/>
+      </w:pPr>
+      <w:rPr>
+        <w:rFonts w:ascii="Wingdings" w:hAnsi="Wingdings" w:hint="default"/>
+        <w:sz w:val="20"/>
+      </w:rPr>
+    </w:lvl>
+    <w:lvl w:ilvl="8" w:tentative="1">
+      <w:start w:val="1"/>
+      <w:numFmt w:val="bullet"/>
+      <w:lvlText w:val=""/>
+      <w:lvlJc w:val="left"/>
+      <w:pPr>
+        <w:tabs>
+          <w:tab w:val="num" w:pos="6480"/>
+        </w:tabs>
+        <w:ind w:left="6480" w:hanging="360"/>
+      </w:pPr>
+      <w:rPr>
+        <w:rFonts w:ascii="Wingdings" w:hAnsi="Wingdings" w:hint="default"/>
+        <w:sz w:val="20"/>
+      </w:rPr>
+    </w:lvl>
+  </w:abstractNum>
+  <w:num w:numId="1" w16cid:durableId="1564411138">
+    <w:abstractNumId w:val="1"/>
+  </w:num>
+  <w:num w:numId="2" w16cid:durableId="1540775094">
+    <w:abstractNumId w:val="5"/>
+  </w:num>
+  <w:num w:numId="3" w16cid:durableId="1124347880">
+    <w:abstractNumId w:val="6"/>
+  </w:num>
+  <w:num w:numId="4" w16cid:durableId="693194641">
+    <w:abstractNumId w:val="0"/>
+  </w:num>
+  <w:num w:numId="5" w16cid:durableId="1527281805">
+    <w:abstractNumId w:val="2"/>
+  </w:num>
+  <w:num w:numId="6" w16cid:durableId="1317607211">
+    <w:abstractNumId w:val="8"/>
+  </w:num>
+  <w:num w:numId="7" w16cid:durableId="1155609184">
+    <w:abstractNumId w:val="7"/>
+  </w:num>
+  <w:num w:numId="8" w16cid:durableId="300813785">
+    <w:abstractNumId w:val="4"/>
+  </w:num>
+  <w:num w:numId="9" w16cid:durableId="433984330">
+    <w:abstractNumId w:val="9"/>
+  </w:num>
+  <w:num w:numId="10" w16cid:durableId="1078015900">
+    <w:abstractNumId w:val="3"/>
+  </w:num>
+</w:numbering>
 </file>
 
 <file path=word/styles.xml><?xml version="1.0" encoding="utf-8"?>
@@ -3928,7 +6127,6 @@
   <w:style w:type="character" w:default="1" w:styleId="DefaultParagraphFont">
     <w:name w:val="Default Paragraph Font"/>
     <w:uiPriority w:val="1"/>
-    <w:semiHidden/>
     <w:unhideWhenUsed/>
   </w:style>
   <w:style w:type="table" w:default="1" w:styleId="TableNormal">

</xml_diff>